<commit_message>
Sistemati bug ricerca e aggiunta e inizio docu, 28/3/26
</commit_message>
<xml_diff>
--- a/4_Diari/Diario - OraX.docx
+++ b/4_Diari/Diario - OraX.docx
@@ -3163,6 +3163,7 @@
               <w:rPr>
                 <w:rFonts w:ascii="Arial" w:hAnsi="Arial" w:cs="Arial"/>
               </w:rPr>
+              <w:lastRenderedPageBreak/>
               <w:t>Luogo</w:t>
             </w:r>
           </w:p>
@@ -4049,6 +4050,7 @@
               <w:rPr>
                 <w:rFonts w:ascii="Arial" w:hAnsi="Arial" w:cs="Arial"/>
               </w:rPr>
+              <w:lastRenderedPageBreak/>
               <w:t>Sprint Retrospective</w:t>
             </w:r>
           </w:p>
@@ -4118,6 +4120,7 @@
               <w:rPr>
                 <w:rFonts w:ascii="Arial" w:hAnsi="Arial" w:cs="Arial"/>
               </w:rPr>
+              <w:lastRenderedPageBreak/>
               <w:t>Luogo</w:t>
             </w:r>
           </w:p>
@@ -4930,6 +4933,7 @@
               <w:rPr>
                 <w:rFonts w:ascii="Arial" w:hAnsi="Arial" w:cs="Arial"/>
               </w:rPr>
+              <w:lastRenderedPageBreak/>
               <w:t>Luogo</w:t>
             </w:r>
           </w:p>
@@ -5558,6 +5562,7 @@
               <w:rPr>
                 <w:rFonts w:ascii="Arial" w:hAnsi="Arial" w:cs="Arial"/>
               </w:rPr>
+              <w:lastRenderedPageBreak/>
               <w:t>Applicare DB anche al calendario</w:t>
             </w:r>
           </w:p>
@@ -5927,6 +5932,3937 @@
           <w:p>
             <w:pPr>
               <w:spacing w:after="200" w:line="276" w:lineRule="auto"/>
+              <w:rPr>
+                <w:rFonts w:ascii="Arial" w:hAnsi="Arial" w:cs="Arial"/>
+              </w:rPr>
+            </w:pPr>
+          </w:p>
+        </w:tc>
+      </w:tr>
+    </w:tbl>
+    <w:p>
+      <w:pPr>
+        <w:rPr>
+          <w:rFonts w:ascii="Arial" w:hAnsi="Arial" w:cs="Arial"/>
+        </w:rPr>
+      </w:pPr>
+    </w:p>
+    <w:p>
+      <w:pPr>
+        <w:rPr>
+          <w:rFonts w:ascii="Arial" w:hAnsi="Arial" w:cs="Arial"/>
+        </w:rPr>
+      </w:pPr>
+      <w:r>
+        <w:rPr>
+          <w:rFonts w:ascii="Arial" w:hAnsi="Arial" w:cs="Arial"/>
+        </w:rPr>
+        <w:br w:type="page"/>
+      </w:r>
+    </w:p>
+    <w:tbl>
+      <w:tblPr>
+        <w:tblStyle w:val="Grigliatabella"/>
+        <w:tblW w:w="9634" w:type="dxa"/>
+        <w:tblLook w:val="04A0" w:firstRow="1" w:lastRow="0" w:firstColumn="1" w:lastColumn="0" w:noHBand="0" w:noVBand="1"/>
+      </w:tblPr>
+      <w:tblGrid>
+        <w:gridCol w:w="4803"/>
+        <w:gridCol w:w="4831"/>
+      </w:tblGrid>
+      <w:tr>
+        <w:trPr>
+          <w:trHeight w:hRule="exact" w:val="397"/>
+        </w:trPr>
+        <w:tc>
+          <w:tcPr>
+            <w:tcW w:w="4803" w:type="dxa"/>
+            <w:tcBorders>
+              <w:top w:val="single" w:sz="4" w:space="0" w:color="auto"/>
+              <w:left w:val="single" w:sz="4" w:space="0" w:color="auto"/>
+              <w:bottom w:val="single" w:sz="4" w:space="0" w:color="auto"/>
+              <w:right w:val="single" w:sz="4" w:space="0" w:color="auto"/>
+            </w:tcBorders>
+            <w:vAlign w:val="center"/>
+            <w:hideMark/>
+          </w:tcPr>
+          <w:p>
+            <w:pPr>
+              <w:spacing w:after="200" w:line="276" w:lineRule="auto"/>
+              <w:rPr>
+                <w:rFonts w:ascii="Arial" w:hAnsi="Arial" w:cs="Arial"/>
+              </w:rPr>
+            </w:pPr>
+            <w:r>
+              <w:rPr>
+                <w:rFonts w:ascii="Arial" w:hAnsi="Arial" w:cs="Arial"/>
+              </w:rPr>
+              <w:lastRenderedPageBreak/>
+              <w:t>Luogo</w:t>
+            </w:r>
+          </w:p>
+        </w:tc>
+        <w:tc>
+          <w:tcPr>
+            <w:tcW w:w="4831" w:type="dxa"/>
+            <w:tcBorders>
+              <w:top w:val="single" w:sz="4" w:space="0" w:color="auto"/>
+              <w:left w:val="single" w:sz="4" w:space="0" w:color="auto"/>
+              <w:bottom w:val="single" w:sz="4" w:space="0" w:color="auto"/>
+              <w:right w:val="single" w:sz="4" w:space="0" w:color="auto"/>
+            </w:tcBorders>
+            <w:vAlign w:val="center"/>
+            <w:hideMark/>
+          </w:tcPr>
+          <w:p>
+            <w:pPr>
+              <w:spacing w:after="200" w:line="276" w:lineRule="auto"/>
+              <w:rPr>
+                <w:rFonts w:ascii="Arial" w:hAnsi="Arial" w:cs="Arial"/>
+              </w:rPr>
+            </w:pPr>
+            <w:r>
+              <w:rPr>
+                <w:rFonts w:ascii="Arial" w:hAnsi="Arial" w:cs="Arial"/>
+              </w:rPr>
+              <w:t>Canobbio</w:t>
+            </w:r>
+          </w:p>
+        </w:tc>
+      </w:tr>
+      <w:tr>
+        <w:trPr>
+          <w:trHeight w:hRule="exact" w:val="397"/>
+        </w:trPr>
+        <w:tc>
+          <w:tcPr>
+            <w:tcW w:w="4803" w:type="dxa"/>
+            <w:tcBorders>
+              <w:top w:val="single" w:sz="4" w:space="0" w:color="auto"/>
+              <w:left w:val="single" w:sz="4" w:space="0" w:color="auto"/>
+              <w:bottom w:val="single" w:sz="4" w:space="0" w:color="auto"/>
+              <w:right w:val="single" w:sz="4" w:space="0" w:color="auto"/>
+            </w:tcBorders>
+            <w:vAlign w:val="center"/>
+            <w:hideMark/>
+          </w:tcPr>
+          <w:p>
+            <w:pPr>
+              <w:spacing w:after="200" w:line="276" w:lineRule="auto"/>
+              <w:rPr>
+                <w:rFonts w:ascii="Arial" w:hAnsi="Arial" w:cs="Arial"/>
+              </w:rPr>
+            </w:pPr>
+            <w:r>
+              <w:rPr>
+                <w:rFonts w:ascii="Arial" w:hAnsi="Arial" w:cs="Arial"/>
+              </w:rPr>
+              <w:t>Data</w:t>
+            </w:r>
+          </w:p>
+        </w:tc>
+        <w:tc>
+          <w:tcPr>
+            <w:tcW w:w="4831" w:type="dxa"/>
+            <w:tcBorders>
+              <w:top w:val="single" w:sz="4" w:space="0" w:color="auto"/>
+              <w:left w:val="single" w:sz="4" w:space="0" w:color="auto"/>
+              <w:bottom w:val="single" w:sz="4" w:space="0" w:color="auto"/>
+              <w:right w:val="single" w:sz="4" w:space="0" w:color="auto"/>
+            </w:tcBorders>
+            <w:vAlign w:val="center"/>
+            <w:hideMark/>
+          </w:tcPr>
+          <w:p>
+            <w:pPr>
+              <w:spacing w:after="200" w:line="276" w:lineRule="auto"/>
+              <w:rPr>
+                <w:rFonts w:ascii="Arial" w:hAnsi="Arial" w:cs="Arial"/>
+              </w:rPr>
+            </w:pPr>
+            <w:r>
+              <w:rPr>
+                <w:rFonts w:ascii="Arial" w:hAnsi="Arial" w:cs="Arial"/>
+              </w:rPr>
+              <w:t>20</w:t>
+            </w:r>
+            <w:r>
+              <w:rPr>
+                <w:rFonts w:ascii="Arial" w:hAnsi="Arial" w:cs="Arial"/>
+              </w:rPr>
+              <w:t>.03.2026</w:t>
+            </w:r>
+          </w:p>
+        </w:tc>
+      </w:tr>
+    </w:tbl>
+    <w:p>
+      <w:pPr>
+        <w:rPr>
+          <w:rFonts w:ascii="Arial" w:hAnsi="Arial" w:cs="Arial"/>
+        </w:rPr>
+      </w:pPr>
+    </w:p>
+    <w:tbl>
+      <w:tblPr>
+        <w:tblStyle w:val="Grigliatabella"/>
+        <w:tblW w:w="0" w:type="auto"/>
+        <w:tblLook w:val="04A0" w:firstRow="1" w:lastRow="0" w:firstColumn="1" w:lastColumn="0" w:noHBand="0" w:noVBand="1"/>
+      </w:tblPr>
+      <w:tblGrid>
+        <w:gridCol w:w="9628"/>
+      </w:tblGrid>
+      <w:tr>
+        <w:tc>
+          <w:tcPr>
+            <w:tcW w:w="9854" w:type="dxa"/>
+            <w:tcBorders>
+              <w:top w:val="single" w:sz="4" w:space="0" w:color="auto"/>
+              <w:left w:val="single" w:sz="4" w:space="0" w:color="auto"/>
+              <w:bottom w:val="single" w:sz="4" w:space="0" w:color="auto"/>
+              <w:right w:val="single" w:sz="4" w:space="0" w:color="auto"/>
+            </w:tcBorders>
+            <w:shd w:val="clear" w:color="auto" w:fill="D9D9D9" w:themeFill="background1" w:themeFillShade="D9"/>
+            <w:hideMark/>
+          </w:tcPr>
+          <w:p>
+            <w:pPr>
+              <w:spacing w:after="200" w:line="276" w:lineRule="auto"/>
+              <w:rPr>
+                <w:rFonts w:ascii="Arial" w:hAnsi="Arial" w:cs="Arial"/>
+              </w:rPr>
+            </w:pPr>
+            <w:r>
+              <w:rPr>
+                <w:rFonts w:ascii="Arial" w:hAnsi="Arial" w:cs="Arial"/>
+              </w:rPr>
+              <w:t>Lavori svolti</w:t>
+            </w:r>
+          </w:p>
+        </w:tc>
+      </w:tr>
+      <w:tr>
+        <w:tc>
+          <w:tcPr>
+            <w:tcW w:w="9854" w:type="dxa"/>
+            <w:tcBorders>
+              <w:top w:val="single" w:sz="4" w:space="0" w:color="auto"/>
+              <w:left w:val="single" w:sz="4" w:space="0" w:color="auto"/>
+              <w:bottom w:val="single" w:sz="4" w:space="0" w:color="auto"/>
+              <w:right w:val="single" w:sz="4" w:space="0" w:color="auto"/>
+            </w:tcBorders>
+            <w:hideMark/>
+          </w:tcPr>
+          <w:p>
+            <w:pPr>
+              <w:spacing w:after="200" w:line="276" w:lineRule="auto"/>
+              <w:rPr>
+                <w:rFonts w:ascii="Arial" w:hAnsi="Arial" w:cs="Arial"/>
+              </w:rPr>
+            </w:pPr>
+            <w:r>
+              <w:rPr>
+                <w:rFonts w:ascii="Arial" w:hAnsi="Arial" w:cs="Arial"/>
+              </w:rPr>
+              <w:t>Ryan:</w:t>
+            </w:r>
+          </w:p>
+          <w:p>
+            <w:pPr>
+              <w:numPr>
+                <w:ilvl w:val="0"/>
+                <w:numId w:val="31"/>
+              </w:numPr>
+              <w:spacing w:after="200" w:line="276" w:lineRule="auto"/>
+              <w:rPr>
+                <w:rFonts w:ascii="Arial" w:hAnsi="Arial" w:cs="Arial"/>
+              </w:rPr>
+            </w:pPr>
+            <w:r>
+              <w:rPr>
+                <w:rFonts w:ascii="Arial" w:hAnsi="Arial" w:cs="Arial"/>
+              </w:rPr>
+              <w:t>Implementato attività su più g</w:t>
+            </w:r>
+            <w:r>
+              <w:rPr>
+                <w:rFonts w:ascii="Arial" w:hAnsi="Arial" w:cs="Arial"/>
+              </w:rPr>
+              <w:t>iorni</w:t>
+            </w:r>
+          </w:p>
+          <w:p>
+            <w:pPr>
+              <w:numPr>
+                <w:ilvl w:val="0"/>
+                <w:numId w:val="31"/>
+              </w:numPr>
+              <w:spacing w:after="200" w:line="276" w:lineRule="auto"/>
+              <w:rPr>
+                <w:rFonts w:ascii="Arial" w:hAnsi="Arial" w:cs="Arial"/>
+              </w:rPr>
+            </w:pPr>
+            <w:r>
+              <w:rPr>
+                <w:rFonts w:ascii="Arial" w:hAnsi="Arial" w:cs="Arial"/>
+              </w:rPr>
+              <w:t>Eliminazione attività</w:t>
+            </w:r>
+          </w:p>
+          <w:p>
+            <w:pPr>
+              <w:numPr>
+                <w:ilvl w:val="0"/>
+                <w:numId w:val="31"/>
+              </w:numPr>
+              <w:spacing w:after="200" w:line="276" w:lineRule="auto"/>
+              <w:rPr>
+                <w:rFonts w:ascii="Arial" w:hAnsi="Arial" w:cs="Arial"/>
+              </w:rPr>
+            </w:pPr>
+            <w:r>
+              <w:rPr>
+                <w:rFonts w:ascii="Arial" w:hAnsi="Arial" w:cs="Arial"/>
+              </w:rPr>
+              <w:t>Poster: porte aperte SAMT</w:t>
+            </w:r>
+          </w:p>
+          <w:p>
+            <w:pPr>
+              <w:numPr>
+                <w:ilvl w:val="0"/>
+                <w:numId w:val="31"/>
+              </w:numPr>
+              <w:spacing w:after="200" w:line="276" w:lineRule="auto"/>
+              <w:rPr>
+                <w:rFonts w:ascii="Arial" w:hAnsi="Arial" w:cs="Arial"/>
+              </w:rPr>
+            </w:pPr>
+            <w:r>
+              <w:rPr>
+                <w:rFonts w:ascii="Arial" w:hAnsi="Arial" w:cs="Arial"/>
+              </w:rPr>
+              <w:t>Font Apple</w:t>
+            </w:r>
+          </w:p>
+          <w:p>
+            <w:pPr>
+              <w:spacing w:after="200" w:line="276" w:lineRule="auto"/>
+              <w:rPr>
+                <w:rFonts w:ascii="Arial" w:hAnsi="Arial" w:cs="Arial"/>
+              </w:rPr>
+            </w:pPr>
+            <w:r>
+              <w:rPr>
+                <w:rFonts w:ascii="Arial" w:hAnsi="Arial" w:cs="Arial"/>
+              </w:rPr>
+              <w:t>Tessa:</w:t>
+            </w:r>
+          </w:p>
+          <w:p>
+            <w:pPr>
+              <w:numPr>
+                <w:ilvl w:val="0"/>
+                <w:numId w:val="31"/>
+              </w:numPr>
+              <w:spacing w:after="200" w:line="276" w:lineRule="auto"/>
+              <w:rPr>
+                <w:rFonts w:ascii="Arial" w:hAnsi="Arial" w:cs="Arial"/>
+              </w:rPr>
+            </w:pPr>
+            <w:r>
+              <w:rPr>
+                <w:rFonts w:ascii="Arial" w:hAnsi="Arial" w:cs="Arial"/>
+              </w:rPr>
+              <w:t>Stile pagine</w:t>
+            </w:r>
+          </w:p>
+          <w:p>
+            <w:pPr>
+              <w:numPr>
+                <w:ilvl w:val="0"/>
+                <w:numId w:val="31"/>
+              </w:numPr>
+              <w:spacing w:after="200" w:line="276" w:lineRule="auto"/>
+              <w:rPr>
+                <w:rFonts w:ascii="Arial" w:hAnsi="Arial" w:cs="Arial"/>
+              </w:rPr>
+            </w:pPr>
+            <w:r>
+              <w:rPr>
+                <w:rFonts w:ascii="Arial" w:hAnsi="Arial" w:cs="Arial"/>
+              </w:rPr>
+              <w:t>Font Apple</w:t>
+            </w:r>
+          </w:p>
+          <w:p>
+            <w:pPr>
+              <w:numPr>
+                <w:ilvl w:val="0"/>
+                <w:numId w:val="31"/>
+              </w:numPr>
+              <w:spacing w:after="200" w:line="276" w:lineRule="auto"/>
+              <w:rPr>
+                <w:rFonts w:ascii="Arial" w:hAnsi="Arial" w:cs="Arial"/>
+              </w:rPr>
+            </w:pPr>
+            <w:r>
+              <w:rPr>
+                <w:rFonts w:ascii="Arial" w:hAnsi="Arial" w:cs="Arial"/>
+              </w:rPr>
+              <w:t>Layout Login e Registrazione</w:t>
+            </w:r>
+          </w:p>
+          <w:p>
+            <w:pPr>
+              <w:spacing w:after="200" w:line="276" w:lineRule="auto"/>
+              <w:rPr>
+                <w:rFonts w:ascii="Arial" w:hAnsi="Arial" w:cs="Arial"/>
+              </w:rPr>
+            </w:pPr>
+            <w:r>
+              <w:rPr>
+                <w:rFonts w:ascii="Arial" w:hAnsi="Arial" w:cs="Arial"/>
+              </w:rPr>
+              <w:t>Linda</w:t>
+            </w:r>
+            <w:r>
+              <w:rPr>
+                <w:rFonts w:ascii="Arial" w:hAnsi="Arial" w:cs="Arial"/>
+              </w:rPr>
+              <w:t xml:space="preserve">: </w:t>
+            </w:r>
+          </w:p>
+          <w:p>
+            <w:pPr>
+              <w:numPr>
+                <w:ilvl w:val="0"/>
+                <w:numId w:val="31"/>
+              </w:numPr>
+              <w:spacing w:after="200" w:line="276" w:lineRule="auto"/>
+              <w:rPr>
+                <w:rFonts w:ascii="Arial" w:hAnsi="Arial" w:cs="Arial"/>
+              </w:rPr>
+            </w:pPr>
+            <w:r>
+              <w:rPr>
+                <w:rFonts w:ascii="Arial" w:hAnsi="Arial" w:cs="Arial"/>
+              </w:rPr>
+              <w:t>Implementazione del profilo utente</w:t>
+            </w:r>
+          </w:p>
+          <w:p>
+            <w:pPr>
+              <w:numPr>
+                <w:ilvl w:val="0"/>
+                <w:numId w:val="31"/>
+              </w:numPr>
+              <w:spacing w:after="200" w:line="276" w:lineRule="auto"/>
+              <w:rPr>
+                <w:rFonts w:ascii="Arial" w:hAnsi="Arial" w:cs="Arial"/>
+              </w:rPr>
+            </w:pPr>
+            <w:r>
+              <w:rPr>
+                <w:rFonts w:ascii="Arial" w:hAnsi="Arial" w:cs="Arial"/>
+              </w:rPr>
+              <w:t>Modifica profilo</w:t>
+            </w:r>
+          </w:p>
+          <w:p>
+            <w:pPr>
+              <w:numPr>
+                <w:ilvl w:val="0"/>
+                <w:numId w:val="31"/>
+              </w:numPr>
+              <w:spacing w:after="200" w:line="276" w:lineRule="auto"/>
+              <w:rPr>
+                <w:rFonts w:ascii="Arial" w:hAnsi="Arial" w:cs="Arial"/>
+              </w:rPr>
+            </w:pPr>
+            <w:r>
+              <w:rPr>
+                <w:rFonts w:ascii="Arial" w:hAnsi="Arial" w:cs="Arial"/>
+              </w:rPr>
+              <w:t>Statistiche</w:t>
+            </w:r>
+          </w:p>
+          <w:p>
+            <w:pPr>
+              <w:numPr>
+                <w:ilvl w:val="0"/>
+                <w:numId w:val="31"/>
+              </w:numPr>
+              <w:spacing w:after="200" w:line="276" w:lineRule="auto"/>
+              <w:rPr>
+                <w:rFonts w:ascii="Arial" w:hAnsi="Arial" w:cs="Arial"/>
+              </w:rPr>
+            </w:pPr>
+            <w:r>
+              <w:rPr>
+                <w:rFonts w:ascii="Arial" w:hAnsi="Arial" w:cs="Arial"/>
+              </w:rPr>
+              <w:t>Font Apple</w:t>
+            </w:r>
+          </w:p>
+          <w:p>
+            <w:pPr>
+              <w:spacing w:after="200" w:line="276" w:lineRule="auto"/>
+              <w:rPr>
+                <w:rFonts w:ascii="Arial" w:hAnsi="Arial" w:cs="Arial"/>
+              </w:rPr>
+            </w:pPr>
+            <w:r>
+              <w:rPr>
+                <w:rFonts w:ascii="Arial" w:hAnsi="Arial" w:cs="Arial"/>
+              </w:rPr>
+              <w:t>Ryan e Linda: le nostre pagine sono statiche poiché Tessa gestisce il database che andrà implementato anche sul calendario e il profilo una volta unito tutto.</w:t>
+            </w:r>
+          </w:p>
+        </w:tc>
+      </w:tr>
+    </w:tbl>
+    <w:p>
+      <w:pPr>
+        <w:rPr>
+          <w:rFonts w:ascii="Arial" w:hAnsi="Arial" w:cs="Arial"/>
+        </w:rPr>
+      </w:pPr>
+    </w:p>
+    <w:tbl>
+      <w:tblPr>
+        <w:tblStyle w:val="Grigliatabella"/>
+        <w:tblW w:w="0" w:type="auto"/>
+        <w:tblLook w:val="04A0" w:firstRow="1" w:lastRow="0" w:firstColumn="1" w:lastColumn="0" w:noHBand="0" w:noVBand="1"/>
+      </w:tblPr>
+      <w:tblGrid>
+        <w:gridCol w:w="9628"/>
+      </w:tblGrid>
+      <w:tr>
+        <w:tc>
+          <w:tcPr>
+            <w:tcW w:w="9854" w:type="dxa"/>
+            <w:tcBorders>
+              <w:top w:val="single" w:sz="4" w:space="0" w:color="auto"/>
+              <w:left w:val="single" w:sz="4" w:space="0" w:color="auto"/>
+              <w:bottom w:val="single" w:sz="4" w:space="0" w:color="auto"/>
+              <w:right w:val="single" w:sz="4" w:space="0" w:color="auto"/>
+            </w:tcBorders>
+            <w:shd w:val="clear" w:color="auto" w:fill="D9D9D9" w:themeFill="background1" w:themeFillShade="D9"/>
+            <w:hideMark/>
+          </w:tcPr>
+          <w:p>
+            <w:pPr>
+              <w:spacing w:after="200" w:line="276" w:lineRule="auto"/>
+              <w:rPr>
+                <w:rFonts w:ascii="Arial" w:hAnsi="Arial" w:cs="Arial"/>
+              </w:rPr>
+            </w:pPr>
+            <w:r>
+              <w:rPr>
+                <w:rFonts w:ascii="Arial" w:hAnsi="Arial" w:cs="Arial"/>
+              </w:rPr>
+              <w:t>Problemi riscontrati e soluzioni adottate</w:t>
+            </w:r>
+          </w:p>
+        </w:tc>
+      </w:tr>
+      <w:tr>
+        <w:tc>
+          <w:tcPr>
+            <w:tcW w:w="9854" w:type="dxa"/>
+            <w:tcBorders>
+              <w:top w:val="single" w:sz="4" w:space="0" w:color="auto"/>
+              <w:left w:val="single" w:sz="4" w:space="0" w:color="auto"/>
+              <w:bottom w:val="single" w:sz="4" w:space="0" w:color="auto"/>
+              <w:right w:val="single" w:sz="4" w:space="0" w:color="auto"/>
+            </w:tcBorders>
+          </w:tcPr>
+          <w:p>
+            <w:pPr>
+              <w:spacing w:after="200" w:line="276" w:lineRule="auto"/>
+              <w:rPr>
+                <w:rFonts w:ascii="Arial" w:hAnsi="Arial" w:cs="Arial"/>
+              </w:rPr>
+            </w:pPr>
+            <w:r>
+              <w:rPr>
+                <w:rFonts w:ascii="Arial" w:hAnsi="Arial" w:cs="Arial"/>
+              </w:rPr>
+              <w:t>Ryan:</w:t>
+            </w:r>
+          </w:p>
+          <w:p>
+            <w:pPr>
+              <w:pStyle w:val="Paragrafoelenco"/>
+              <w:numPr>
+                <w:ilvl w:val="0"/>
+                <w:numId w:val="31"/>
+              </w:numPr>
+              <w:rPr>
+                <w:rFonts w:ascii="Arial" w:hAnsi="Arial" w:cs="Arial"/>
+              </w:rPr>
+            </w:pPr>
+            <w:r>
+              <w:rPr>
+                <w:rFonts w:ascii="Arial" w:hAnsi="Arial" w:cs="Arial"/>
+              </w:rPr>
+              <w:t>Problema: prendeva nel calendario la domenica come primo giorno della settimana</w:t>
+            </w:r>
+          </w:p>
+          <w:p>
+            <w:pPr>
+              <w:pStyle w:val="Paragrafoelenco"/>
+              <w:numPr>
+                <w:ilvl w:val="0"/>
+                <w:numId w:val="31"/>
+              </w:numPr>
+              <w:rPr>
+                <w:rFonts w:ascii="Arial" w:hAnsi="Arial" w:cs="Arial"/>
+              </w:rPr>
+            </w:pPr>
+            <w:r>
+              <w:rPr>
+                <w:rFonts w:ascii="Arial" w:hAnsi="Arial" w:cs="Arial"/>
+              </w:rPr>
+              <w:t>Soluzione: usato attributo FirstDayOfWeek per impostare il lunedì come primo giorno</w:t>
+            </w:r>
+          </w:p>
+          <w:p>
+            <w:pPr>
+              <w:rPr>
+                <w:rFonts w:ascii="Arial" w:hAnsi="Arial" w:cs="Arial"/>
+              </w:rPr>
+            </w:pPr>
+            <w:r>
+              <w:rPr>
+                <w:rFonts w:ascii="Arial" w:hAnsi="Arial" w:cs="Arial"/>
+              </w:rPr>
+              <w:t>Tessa:</w:t>
+            </w:r>
+          </w:p>
+          <w:p>
+            <w:pPr>
+              <w:pStyle w:val="Paragrafoelenco"/>
+              <w:numPr>
+                <w:ilvl w:val="0"/>
+                <w:numId w:val="31"/>
+              </w:numPr>
+              <w:rPr>
+                <w:rFonts w:ascii="Arial" w:hAnsi="Arial" w:cs="Arial"/>
+              </w:rPr>
+            </w:pPr>
+            <w:r>
+              <w:rPr>
+                <w:rFonts w:ascii="Arial" w:hAnsi="Arial" w:cs="Arial"/>
+              </w:rPr>
+              <w:t>Problema: non trovava il file del database</w:t>
+            </w:r>
+          </w:p>
+          <w:p>
+            <w:pPr>
+              <w:pStyle w:val="Paragrafoelenco"/>
+              <w:numPr>
+                <w:ilvl w:val="0"/>
+                <w:numId w:val="31"/>
+              </w:numPr>
+              <w:rPr>
+                <w:rFonts w:ascii="Arial" w:hAnsi="Arial" w:cs="Arial"/>
+              </w:rPr>
+            </w:pPr>
+            <w:r>
+              <w:rPr>
+                <w:rFonts w:ascii="Arial" w:hAnsi="Arial" w:cs="Arial"/>
+              </w:rPr>
+              <w:t>Soluzione: era nei nascosti della cartella locale</w:t>
+            </w:r>
+          </w:p>
+          <w:p>
+            <w:pPr>
+              <w:rPr>
+                <w:rFonts w:ascii="Arial" w:hAnsi="Arial" w:cs="Arial"/>
+              </w:rPr>
+            </w:pPr>
+            <w:r>
+              <w:rPr>
+                <w:rFonts w:ascii="Arial" w:hAnsi="Arial" w:cs="Arial"/>
+              </w:rPr>
+              <w:t>Linda:</w:t>
+            </w:r>
+          </w:p>
+          <w:p>
+            <w:pPr>
+              <w:pStyle w:val="Paragrafoelenco"/>
+              <w:numPr>
+                <w:ilvl w:val="0"/>
+                <w:numId w:val="31"/>
+              </w:numPr>
+              <w:rPr>
+                <w:rFonts w:ascii="Arial" w:hAnsi="Arial" w:cs="Arial"/>
+              </w:rPr>
+            </w:pPr>
+            <w:r>
+              <w:rPr>
+                <w:rFonts w:ascii="Arial" w:hAnsi="Arial" w:cs="Arial"/>
+              </w:rPr>
+              <w:t>Problema: l’app non compilava</w:t>
+            </w:r>
+          </w:p>
+          <w:p>
+            <w:pPr>
+              <w:pStyle w:val="Paragrafoelenco"/>
+              <w:numPr>
+                <w:ilvl w:val="0"/>
+                <w:numId w:val="31"/>
+              </w:numPr>
+              <w:rPr>
+                <w:rFonts w:ascii="Arial" w:hAnsi="Arial" w:cs="Arial"/>
+              </w:rPr>
+            </w:pPr>
+            <w:r>
+              <w:rPr>
+                <w:rFonts w:ascii="Arial" w:hAnsi="Arial" w:cs="Arial"/>
+              </w:rPr>
+              <w:t>Soluzione: preso il progetto base da GitHub e rifatto (provate altre soluzioni ma non funzionavano)</w:t>
+            </w:r>
+          </w:p>
+          <w:p>
+            <w:pPr>
+              <w:rPr>
+                <w:rFonts w:ascii="Arial" w:hAnsi="Arial" w:cs="Arial"/>
+              </w:rPr>
+            </w:pPr>
+          </w:p>
+        </w:tc>
+      </w:tr>
+    </w:tbl>
+    <w:p>
+      <w:pPr>
+        <w:rPr>
+          <w:rFonts w:ascii="Arial" w:hAnsi="Arial" w:cs="Arial"/>
+        </w:rPr>
+      </w:pPr>
+    </w:p>
+    <w:tbl>
+      <w:tblPr>
+        <w:tblStyle w:val="Grigliatabella"/>
+        <w:tblW w:w="0" w:type="auto"/>
+        <w:tblLook w:val="04A0" w:firstRow="1" w:lastRow="0" w:firstColumn="1" w:lastColumn="0" w:noHBand="0" w:noVBand="1"/>
+      </w:tblPr>
+      <w:tblGrid>
+        <w:gridCol w:w="9628"/>
+      </w:tblGrid>
+      <w:tr>
+        <w:tc>
+          <w:tcPr>
+            <w:tcW w:w="9854" w:type="dxa"/>
+            <w:tcBorders>
+              <w:top w:val="single" w:sz="4" w:space="0" w:color="auto"/>
+              <w:left w:val="single" w:sz="4" w:space="0" w:color="auto"/>
+              <w:bottom w:val="single" w:sz="4" w:space="0" w:color="auto"/>
+              <w:right w:val="single" w:sz="4" w:space="0" w:color="auto"/>
+            </w:tcBorders>
+            <w:shd w:val="clear" w:color="auto" w:fill="D9D9D9" w:themeFill="background1" w:themeFillShade="D9"/>
+            <w:hideMark/>
+          </w:tcPr>
+          <w:p>
+            <w:pPr>
+              <w:spacing w:after="200" w:line="276" w:lineRule="auto"/>
+              <w:rPr>
+                <w:rFonts w:ascii="Arial" w:hAnsi="Arial" w:cs="Arial"/>
+              </w:rPr>
+            </w:pPr>
+            <w:r>
+              <w:rPr>
+                <w:rFonts w:ascii="Arial" w:hAnsi="Arial" w:cs="Arial"/>
+              </w:rPr>
+              <w:t>Punto della situazione rispetto alla pianificazione</w:t>
+            </w:r>
+          </w:p>
+        </w:tc>
+      </w:tr>
+      <w:tr>
+        <w:tc>
+          <w:tcPr>
+            <w:tcW w:w="9854" w:type="dxa"/>
+            <w:tcBorders>
+              <w:top w:val="single" w:sz="4" w:space="0" w:color="auto"/>
+              <w:left w:val="single" w:sz="4" w:space="0" w:color="auto"/>
+              <w:bottom w:val="single" w:sz="4" w:space="0" w:color="auto"/>
+              <w:right w:val="single" w:sz="4" w:space="0" w:color="auto"/>
+            </w:tcBorders>
+            <w:hideMark/>
+          </w:tcPr>
+          <w:p>
+            <w:pPr>
+              <w:spacing w:after="200" w:line="276" w:lineRule="auto"/>
+              <w:rPr>
+                <w:rFonts w:ascii="Arial" w:hAnsi="Arial" w:cs="Arial"/>
+              </w:rPr>
+            </w:pPr>
+            <w:r>
+              <w:rPr>
+                <w:rFonts w:ascii="Arial" w:hAnsi="Arial" w:cs="Arial"/>
+              </w:rPr>
+              <w:lastRenderedPageBreak/>
+              <w:t xml:space="preserve">Implementazione </w:t>
+            </w:r>
+          </w:p>
+          <w:p>
+            <w:pPr>
+              <w:spacing w:after="200" w:line="276" w:lineRule="auto"/>
+              <w:rPr>
+                <w:rFonts w:ascii="Arial" w:hAnsi="Arial" w:cs="Arial"/>
+              </w:rPr>
+            </w:pPr>
+            <w:r>
+              <w:rPr>
+                <w:rFonts w:ascii="Arial" w:hAnsi="Arial" w:cs="Arial"/>
+              </w:rPr>
+              <w:t>Documentazione: leggermente in ritardo</w:t>
+            </w:r>
+          </w:p>
+        </w:tc>
+      </w:tr>
+    </w:tbl>
+    <w:p>
+      <w:pPr>
+        <w:rPr>
+          <w:rFonts w:ascii="Arial" w:hAnsi="Arial" w:cs="Arial"/>
+        </w:rPr>
+      </w:pPr>
+    </w:p>
+    <w:tbl>
+      <w:tblPr>
+        <w:tblStyle w:val="Grigliatabella"/>
+        <w:tblW w:w="0" w:type="auto"/>
+        <w:tblLook w:val="04A0" w:firstRow="1" w:lastRow="0" w:firstColumn="1" w:lastColumn="0" w:noHBand="0" w:noVBand="1"/>
+      </w:tblPr>
+      <w:tblGrid>
+        <w:gridCol w:w="9628"/>
+      </w:tblGrid>
+      <w:tr>
+        <w:tc>
+          <w:tcPr>
+            <w:tcW w:w="9854" w:type="dxa"/>
+            <w:tcBorders>
+              <w:top w:val="single" w:sz="4" w:space="0" w:color="auto"/>
+              <w:left w:val="single" w:sz="4" w:space="0" w:color="auto"/>
+              <w:bottom w:val="single" w:sz="4" w:space="0" w:color="auto"/>
+              <w:right w:val="single" w:sz="4" w:space="0" w:color="auto"/>
+            </w:tcBorders>
+            <w:shd w:val="clear" w:color="auto" w:fill="D9D9D9" w:themeFill="background1" w:themeFillShade="D9"/>
+            <w:hideMark/>
+          </w:tcPr>
+          <w:p>
+            <w:pPr>
+              <w:spacing w:after="200" w:line="276" w:lineRule="auto"/>
+              <w:rPr>
+                <w:rFonts w:ascii="Arial" w:hAnsi="Arial" w:cs="Arial"/>
+              </w:rPr>
+            </w:pPr>
+            <w:r>
+              <w:rPr>
+                <w:rFonts w:ascii="Arial" w:hAnsi="Arial" w:cs="Arial"/>
+              </w:rPr>
+              <w:t>Programma di massima per la prossima giornata di lavoro</w:t>
+            </w:r>
+          </w:p>
+        </w:tc>
+      </w:tr>
+      <w:tr>
+        <w:tc>
+          <w:tcPr>
+            <w:tcW w:w="9854" w:type="dxa"/>
+            <w:tcBorders>
+              <w:top w:val="single" w:sz="4" w:space="0" w:color="auto"/>
+              <w:left w:val="single" w:sz="4" w:space="0" w:color="auto"/>
+              <w:bottom w:val="single" w:sz="4" w:space="0" w:color="auto"/>
+              <w:right w:val="single" w:sz="4" w:space="0" w:color="auto"/>
+            </w:tcBorders>
+            <w:hideMark/>
+          </w:tcPr>
+          <w:p>
+            <w:pPr>
+              <w:numPr>
+                <w:ilvl w:val="0"/>
+                <w:numId w:val="31"/>
+              </w:numPr>
+              <w:spacing w:after="200" w:line="276" w:lineRule="auto"/>
+              <w:rPr>
+                <w:rFonts w:ascii="Arial" w:hAnsi="Arial" w:cs="Arial"/>
+              </w:rPr>
+            </w:pPr>
+            <w:r>
+              <w:rPr>
+                <w:rFonts w:ascii="Arial" w:hAnsi="Arial" w:cs="Arial"/>
+              </w:rPr>
+              <w:t>Unire le pagine per il review</w:t>
+            </w:r>
+          </w:p>
+          <w:p>
+            <w:pPr>
+              <w:numPr>
+                <w:ilvl w:val="0"/>
+                <w:numId w:val="31"/>
+              </w:numPr>
+              <w:spacing w:after="200" w:line="276" w:lineRule="auto"/>
+              <w:rPr>
+                <w:rFonts w:ascii="Arial" w:hAnsi="Arial" w:cs="Arial"/>
+              </w:rPr>
+            </w:pPr>
+            <w:r>
+              <w:rPr>
+                <w:rFonts w:ascii="Arial" w:hAnsi="Arial" w:cs="Arial"/>
+              </w:rPr>
+              <w:t xml:space="preserve">Continuare il calendario </w:t>
+            </w:r>
+            <w:r>
+              <w:rPr>
+                <w:rFonts w:ascii="Arial" w:hAnsi="Arial" w:cs="Arial"/>
+              </w:rPr>
+              <w:sym w:font="Wingdings" w:char="F0E0"/>
+            </w:r>
+            <w:r>
+              <w:rPr>
+                <w:rFonts w:ascii="Arial" w:hAnsi="Arial" w:cs="Arial"/>
+              </w:rPr>
+              <w:t xml:space="preserve"> applicare filtro/ricerca attività</w:t>
+            </w:r>
+          </w:p>
+          <w:p>
+            <w:pPr>
+              <w:numPr>
+                <w:ilvl w:val="0"/>
+                <w:numId w:val="31"/>
+              </w:numPr>
+              <w:spacing w:after="200" w:line="276" w:lineRule="auto"/>
+              <w:rPr>
+                <w:rFonts w:ascii="Arial" w:hAnsi="Arial" w:cs="Arial"/>
+              </w:rPr>
+            </w:pPr>
+            <w:r>
+              <w:rPr>
+                <w:rFonts w:ascii="Arial" w:hAnsi="Arial" w:cs="Arial"/>
+              </w:rPr>
+              <w:t>Continuare la documentazione</w:t>
+            </w:r>
+          </w:p>
+        </w:tc>
+      </w:tr>
+    </w:tbl>
+    <w:p>
+      <w:pPr>
+        <w:rPr>
+          <w:rFonts w:ascii="Arial" w:hAnsi="Arial" w:cs="Arial"/>
+        </w:rPr>
+      </w:pPr>
+    </w:p>
+    <w:p>
+      <w:pPr>
+        <w:rPr>
+          <w:rFonts w:ascii="Arial" w:hAnsi="Arial" w:cs="Arial"/>
+        </w:rPr>
+      </w:pPr>
+      <w:r>
+        <w:rPr>
+          <w:rFonts w:ascii="Arial" w:hAnsi="Arial" w:cs="Arial"/>
+        </w:rPr>
+        <w:t>Agile - Resoconto</w:t>
+      </w:r>
+    </w:p>
+    <w:p>
+      <w:pPr>
+        <w:rPr>
+          <w:rFonts w:ascii="Arial" w:hAnsi="Arial" w:cs="Arial"/>
+        </w:rPr>
+      </w:pPr>
+    </w:p>
+    <w:tbl>
+      <w:tblPr>
+        <w:tblStyle w:val="Grigliatabella"/>
+        <w:tblW w:w="0" w:type="auto"/>
+        <w:tblLook w:val="04A0" w:firstRow="1" w:lastRow="0" w:firstColumn="1" w:lastColumn="0" w:noHBand="0" w:noVBand="1"/>
+      </w:tblPr>
+      <w:tblGrid>
+        <w:gridCol w:w="9628"/>
+      </w:tblGrid>
+      <w:tr>
+        <w:tc>
+          <w:tcPr>
+            <w:tcW w:w="9854" w:type="dxa"/>
+            <w:tcBorders>
+              <w:top w:val="single" w:sz="4" w:space="0" w:color="auto"/>
+              <w:left w:val="single" w:sz="4" w:space="0" w:color="auto"/>
+              <w:bottom w:val="single" w:sz="4" w:space="0" w:color="auto"/>
+              <w:right w:val="single" w:sz="4" w:space="0" w:color="auto"/>
+            </w:tcBorders>
+            <w:shd w:val="clear" w:color="auto" w:fill="D9D9D9" w:themeFill="background1" w:themeFillShade="D9"/>
+            <w:hideMark/>
+          </w:tcPr>
+          <w:p>
+            <w:pPr>
+              <w:spacing w:after="200" w:line="276" w:lineRule="auto"/>
+              <w:rPr>
+                <w:rFonts w:ascii="Arial" w:hAnsi="Arial" w:cs="Arial"/>
+              </w:rPr>
+            </w:pPr>
+            <w:r>
+              <w:rPr>
+                <w:rFonts w:ascii="Arial" w:hAnsi="Arial" w:cs="Arial"/>
+              </w:rPr>
+              <w:t>Daily Scrum</w:t>
+            </w:r>
+          </w:p>
+        </w:tc>
+      </w:tr>
+      <w:tr>
+        <w:tc>
+          <w:tcPr>
+            <w:tcW w:w="9854" w:type="dxa"/>
+            <w:tcBorders>
+              <w:top w:val="single" w:sz="4" w:space="0" w:color="auto"/>
+              <w:left w:val="single" w:sz="4" w:space="0" w:color="auto"/>
+              <w:bottom w:val="single" w:sz="4" w:space="0" w:color="auto"/>
+              <w:right w:val="single" w:sz="4" w:space="0" w:color="auto"/>
+            </w:tcBorders>
+            <w:hideMark/>
+          </w:tcPr>
+          <w:p>
+            <w:pPr>
+              <w:numPr>
+                <w:ilvl w:val="0"/>
+                <w:numId w:val="31"/>
+              </w:numPr>
+              <w:spacing w:after="200" w:line="276" w:lineRule="auto"/>
+              <w:rPr>
+                <w:rFonts w:ascii="Arial" w:hAnsi="Arial" w:cs="Arial"/>
+              </w:rPr>
+            </w:pPr>
+            <w:r>
+              <w:rPr>
+                <w:rFonts w:ascii="Arial" w:hAnsi="Arial" w:cs="Arial"/>
+              </w:rPr>
+              <w:t>8</w:t>
+            </w:r>
+            <w:r>
+              <w:rPr>
+                <w:rFonts w:ascii="Arial" w:hAnsi="Arial" w:cs="Arial"/>
+              </w:rPr>
+              <w:t>:</w:t>
+            </w:r>
+            <w:r>
+              <w:rPr>
+                <w:rFonts w:ascii="Arial" w:hAnsi="Arial" w:cs="Arial"/>
+              </w:rPr>
+              <w:t>3</w:t>
+            </w:r>
+            <w:r>
+              <w:rPr>
+                <w:rFonts w:ascii="Arial" w:hAnsi="Arial" w:cs="Arial"/>
+              </w:rPr>
+              <w:t>0</w:t>
+            </w:r>
+          </w:p>
+          <w:p>
+            <w:pPr>
+              <w:numPr>
+                <w:ilvl w:val="0"/>
+                <w:numId w:val="31"/>
+              </w:numPr>
+              <w:spacing w:after="200" w:line="276" w:lineRule="auto"/>
+              <w:rPr>
+                <w:rFonts w:ascii="Arial" w:hAnsi="Arial" w:cs="Arial"/>
+              </w:rPr>
+            </w:pPr>
+            <w:r>
+              <w:rPr>
+                <w:rFonts w:ascii="Arial" w:hAnsi="Arial" w:cs="Arial"/>
+              </w:rPr>
+              <w:t>Aggiornato Linda su ciò che è stato svolto la settimana scorsa</w:t>
+            </w:r>
+          </w:p>
+          <w:p>
+            <w:pPr>
+              <w:numPr>
+                <w:ilvl w:val="0"/>
+                <w:numId w:val="31"/>
+              </w:numPr>
+              <w:spacing w:after="200" w:line="276" w:lineRule="auto"/>
+              <w:rPr>
+                <w:rFonts w:ascii="Arial" w:hAnsi="Arial" w:cs="Arial"/>
+              </w:rPr>
+            </w:pPr>
+            <w:r>
+              <w:rPr>
+                <w:rFonts w:ascii="Arial" w:hAnsi="Arial" w:cs="Arial"/>
+              </w:rPr>
+              <w:t>Non sono emersi problemi rilevanti</w:t>
+            </w:r>
+          </w:p>
+        </w:tc>
+      </w:tr>
+    </w:tbl>
+    <w:p>
+      <w:pPr>
+        <w:rPr>
+          <w:rFonts w:ascii="Arial" w:hAnsi="Arial" w:cs="Arial"/>
+        </w:rPr>
+      </w:pPr>
+    </w:p>
+    <w:tbl>
+      <w:tblPr>
+        <w:tblStyle w:val="Grigliatabella"/>
+        <w:tblW w:w="0" w:type="auto"/>
+        <w:tblLook w:val="04A0" w:firstRow="1" w:lastRow="0" w:firstColumn="1" w:lastColumn="0" w:noHBand="0" w:noVBand="1"/>
+      </w:tblPr>
+      <w:tblGrid>
+        <w:gridCol w:w="9628"/>
+      </w:tblGrid>
+      <w:tr>
+        <w:tc>
+          <w:tcPr>
+            <w:tcW w:w="9854" w:type="dxa"/>
+            <w:tcBorders>
+              <w:top w:val="single" w:sz="4" w:space="0" w:color="auto"/>
+              <w:left w:val="single" w:sz="4" w:space="0" w:color="auto"/>
+              <w:bottom w:val="single" w:sz="4" w:space="0" w:color="auto"/>
+              <w:right w:val="single" w:sz="4" w:space="0" w:color="auto"/>
+            </w:tcBorders>
+            <w:shd w:val="clear" w:color="auto" w:fill="D9D9D9" w:themeFill="background1" w:themeFillShade="D9"/>
+            <w:hideMark/>
+          </w:tcPr>
+          <w:p>
+            <w:pPr>
+              <w:spacing w:after="200" w:line="276" w:lineRule="auto"/>
+              <w:rPr>
+                <w:rFonts w:ascii="Arial" w:hAnsi="Arial" w:cs="Arial"/>
+              </w:rPr>
+            </w:pPr>
+            <w:r>
+              <w:rPr>
+                <w:rFonts w:ascii="Arial" w:hAnsi="Arial" w:cs="Arial"/>
+              </w:rPr>
+              <w:t>Sprint Planning</w:t>
+            </w:r>
+          </w:p>
+        </w:tc>
+      </w:tr>
+      <w:tr>
+        <w:tc>
+          <w:tcPr>
+            <w:tcW w:w="9854" w:type="dxa"/>
+            <w:tcBorders>
+              <w:top w:val="single" w:sz="4" w:space="0" w:color="auto"/>
+              <w:left w:val="single" w:sz="4" w:space="0" w:color="auto"/>
+              <w:bottom w:val="single" w:sz="4" w:space="0" w:color="auto"/>
+              <w:right w:val="single" w:sz="4" w:space="0" w:color="auto"/>
+            </w:tcBorders>
+          </w:tcPr>
+          <w:p>
+            <w:pPr>
+              <w:spacing w:after="200" w:line="276" w:lineRule="auto"/>
+              <w:rPr>
+                <w:rFonts w:ascii="Arial" w:hAnsi="Arial" w:cs="Arial"/>
+              </w:rPr>
+            </w:pPr>
+          </w:p>
+        </w:tc>
+      </w:tr>
+    </w:tbl>
+    <w:p>
+      <w:pPr>
+        <w:rPr>
+          <w:rFonts w:ascii="Arial" w:hAnsi="Arial" w:cs="Arial"/>
+        </w:rPr>
+      </w:pPr>
+    </w:p>
+    <w:tbl>
+      <w:tblPr>
+        <w:tblStyle w:val="Grigliatabella"/>
+        <w:tblW w:w="0" w:type="auto"/>
+        <w:tblLook w:val="04A0" w:firstRow="1" w:lastRow="0" w:firstColumn="1" w:lastColumn="0" w:noHBand="0" w:noVBand="1"/>
+      </w:tblPr>
+      <w:tblGrid>
+        <w:gridCol w:w="9628"/>
+      </w:tblGrid>
+      <w:tr>
+        <w:tc>
+          <w:tcPr>
+            <w:tcW w:w="9854" w:type="dxa"/>
+            <w:tcBorders>
+              <w:top w:val="single" w:sz="4" w:space="0" w:color="auto"/>
+              <w:left w:val="single" w:sz="4" w:space="0" w:color="auto"/>
+              <w:bottom w:val="single" w:sz="4" w:space="0" w:color="auto"/>
+              <w:right w:val="single" w:sz="4" w:space="0" w:color="auto"/>
+            </w:tcBorders>
+            <w:shd w:val="clear" w:color="auto" w:fill="D9D9D9" w:themeFill="background1" w:themeFillShade="D9"/>
+            <w:hideMark/>
+          </w:tcPr>
+          <w:p>
+            <w:pPr>
+              <w:spacing w:after="200" w:line="276" w:lineRule="auto"/>
+              <w:rPr>
+                <w:rFonts w:ascii="Arial" w:hAnsi="Arial" w:cs="Arial"/>
+              </w:rPr>
+            </w:pPr>
+            <w:r>
+              <w:rPr>
+                <w:rFonts w:ascii="Arial" w:hAnsi="Arial" w:cs="Arial"/>
+              </w:rPr>
+              <w:t>Sprint Review</w:t>
+            </w:r>
+          </w:p>
+        </w:tc>
+      </w:tr>
+      <w:tr>
+        <w:tc>
+          <w:tcPr>
+            <w:tcW w:w="9854" w:type="dxa"/>
+            <w:tcBorders>
+              <w:top w:val="single" w:sz="4" w:space="0" w:color="auto"/>
+              <w:left w:val="single" w:sz="4" w:space="0" w:color="auto"/>
+              <w:bottom w:val="single" w:sz="4" w:space="0" w:color="auto"/>
+              <w:right w:val="single" w:sz="4" w:space="0" w:color="auto"/>
+            </w:tcBorders>
+          </w:tcPr>
+          <w:p>
+            <w:pPr>
+              <w:spacing w:after="200" w:line="276" w:lineRule="auto"/>
+              <w:rPr>
+                <w:rFonts w:ascii="Arial" w:hAnsi="Arial" w:cs="Arial"/>
+              </w:rPr>
+            </w:pPr>
+          </w:p>
+        </w:tc>
+      </w:tr>
+    </w:tbl>
+    <w:p>
+      <w:pPr>
+        <w:rPr>
+          <w:rFonts w:ascii="Arial" w:hAnsi="Arial" w:cs="Arial"/>
+        </w:rPr>
+      </w:pPr>
+    </w:p>
+    <w:tbl>
+      <w:tblPr>
+        <w:tblStyle w:val="Grigliatabella"/>
+        <w:tblW w:w="0" w:type="auto"/>
+        <w:tblLook w:val="04A0" w:firstRow="1" w:lastRow="0" w:firstColumn="1" w:lastColumn="0" w:noHBand="0" w:noVBand="1"/>
+      </w:tblPr>
+      <w:tblGrid>
+        <w:gridCol w:w="9628"/>
+      </w:tblGrid>
+      <w:tr>
+        <w:tc>
+          <w:tcPr>
+            <w:tcW w:w="9854" w:type="dxa"/>
+            <w:tcBorders>
+              <w:top w:val="single" w:sz="4" w:space="0" w:color="auto"/>
+              <w:left w:val="single" w:sz="4" w:space="0" w:color="auto"/>
+              <w:bottom w:val="single" w:sz="4" w:space="0" w:color="auto"/>
+              <w:right w:val="single" w:sz="4" w:space="0" w:color="auto"/>
+            </w:tcBorders>
+            <w:shd w:val="clear" w:color="auto" w:fill="D9D9D9" w:themeFill="background1" w:themeFillShade="D9"/>
+            <w:hideMark/>
+          </w:tcPr>
+          <w:p>
+            <w:pPr>
+              <w:spacing w:after="200" w:line="276" w:lineRule="auto"/>
+              <w:rPr>
+                <w:rFonts w:ascii="Arial" w:hAnsi="Arial" w:cs="Arial"/>
+              </w:rPr>
+            </w:pPr>
+            <w:r>
+              <w:rPr>
+                <w:rFonts w:ascii="Arial" w:hAnsi="Arial" w:cs="Arial"/>
+              </w:rPr>
+              <w:t>Sprint Retrospective</w:t>
+            </w:r>
+          </w:p>
+        </w:tc>
+      </w:tr>
+      <w:tr>
+        <w:tc>
+          <w:tcPr>
+            <w:tcW w:w="9854" w:type="dxa"/>
+            <w:tcBorders>
+              <w:top w:val="single" w:sz="4" w:space="0" w:color="auto"/>
+              <w:left w:val="single" w:sz="4" w:space="0" w:color="auto"/>
+              <w:bottom w:val="single" w:sz="4" w:space="0" w:color="auto"/>
+              <w:right w:val="single" w:sz="4" w:space="0" w:color="auto"/>
+            </w:tcBorders>
+          </w:tcPr>
+          <w:p>
+            <w:pPr>
+              <w:spacing w:after="200" w:line="276" w:lineRule="auto"/>
+              <w:rPr>
+                <w:rFonts w:ascii="Arial" w:hAnsi="Arial" w:cs="Arial"/>
+              </w:rPr>
+            </w:pPr>
+          </w:p>
+        </w:tc>
+      </w:tr>
+    </w:tbl>
+    <w:p>
+      <w:pPr>
+        <w:rPr>
+          <w:rFonts w:ascii="Arial" w:hAnsi="Arial" w:cs="Arial"/>
+        </w:rPr>
+      </w:pPr>
+    </w:p>
+    <w:p>
+      <w:pPr>
+        <w:rPr>
+          <w:rFonts w:ascii="Arial" w:hAnsi="Arial" w:cs="Arial"/>
+        </w:rPr>
+      </w:pPr>
+      <w:r>
+        <w:rPr>
+          <w:rFonts w:ascii="Arial" w:hAnsi="Arial" w:cs="Arial"/>
+        </w:rPr>
+        <w:br w:type="page"/>
+      </w:r>
+    </w:p>
+    <w:tbl>
+      <w:tblPr>
+        <w:tblStyle w:val="Grigliatabella"/>
+        <w:tblW w:w="9634" w:type="dxa"/>
+        <w:tblLook w:val="04A0" w:firstRow="1" w:lastRow="0" w:firstColumn="1" w:lastColumn="0" w:noHBand="0" w:noVBand="1"/>
+      </w:tblPr>
+      <w:tblGrid>
+        <w:gridCol w:w="4803"/>
+        <w:gridCol w:w="4831"/>
+      </w:tblGrid>
+      <w:tr>
+        <w:trPr>
+          <w:trHeight w:hRule="exact" w:val="397"/>
+        </w:trPr>
+        <w:tc>
+          <w:tcPr>
+            <w:tcW w:w="4803" w:type="dxa"/>
+            <w:tcBorders>
+              <w:top w:val="single" w:sz="4" w:space="0" w:color="auto"/>
+              <w:left w:val="single" w:sz="4" w:space="0" w:color="auto"/>
+              <w:bottom w:val="single" w:sz="4" w:space="0" w:color="auto"/>
+              <w:right w:val="single" w:sz="4" w:space="0" w:color="auto"/>
+            </w:tcBorders>
+            <w:vAlign w:val="center"/>
+            <w:hideMark/>
+          </w:tcPr>
+          <w:p>
+            <w:pPr>
+              <w:spacing w:after="200" w:line="276" w:lineRule="auto"/>
+              <w:rPr>
+                <w:rFonts w:ascii="Arial" w:hAnsi="Arial" w:cs="Arial"/>
+              </w:rPr>
+            </w:pPr>
+            <w:r>
+              <w:rPr>
+                <w:rFonts w:ascii="Arial" w:hAnsi="Arial" w:cs="Arial"/>
+              </w:rPr>
+              <w:lastRenderedPageBreak/>
+              <w:t>Luogo</w:t>
+            </w:r>
+          </w:p>
+        </w:tc>
+        <w:tc>
+          <w:tcPr>
+            <w:tcW w:w="4831" w:type="dxa"/>
+            <w:tcBorders>
+              <w:top w:val="single" w:sz="4" w:space="0" w:color="auto"/>
+              <w:left w:val="single" w:sz="4" w:space="0" w:color="auto"/>
+              <w:bottom w:val="single" w:sz="4" w:space="0" w:color="auto"/>
+              <w:right w:val="single" w:sz="4" w:space="0" w:color="auto"/>
+            </w:tcBorders>
+            <w:vAlign w:val="center"/>
+            <w:hideMark/>
+          </w:tcPr>
+          <w:p>
+            <w:pPr>
+              <w:spacing w:after="200" w:line="276" w:lineRule="auto"/>
+              <w:rPr>
+                <w:rFonts w:ascii="Arial" w:hAnsi="Arial" w:cs="Arial"/>
+              </w:rPr>
+            </w:pPr>
+            <w:r>
+              <w:rPr>
+                <w:rFonts w:ascii="Arial" w:hAnsi="Arial" w:cs="Arial"/>
+              </w:rPr>
+              <w:t>Canobbio</w:t>
+            </w:r>
+          </w:p>
+        </w:tc>
+      </w:tr>
+      <w:tr>
+        <w:trPr>
+          <w:trHeight w:hRule="exact" w:val="397"/>
+        </w:trPr>
+        <w:tc>
+          <w:tcPr>
+            <w:tcW w:w="4803" w:type="dxa"/>
+            <w:tcBorders>
+              <w:top w:val="single" w:sz="4" w:space="0" w:color="auto"/>
+              <w:left w:val="single" w:sz="4" w:space="0" w:color="auto"/>
+              <w:bottom w:val="single" w:sz="4" w:space="0" w:color="auto"/>
+              <w:right w:val="single" w:sz="4" w:space="0" w:color="auto"/>
+            </w:tcBorders>
+            <w:vAlign w:val="center"/>
+            <w:hideMark/>
+          </w:tcPr>
+          <w:p>
+            <w:pPr>
+              <w:spacing w:after="200" w:line="276" w:lineRule="auto"/>
+              <w:rPr>
+                <w:rFonts w:ascii="Arial" w:hAnsi="Arial" w:cs="Arial"/>
+              </w:rPr>
+            </w:pPr>
+            <w:r>
+              <w:rPr>
+                <w:rFonts w:ascii="Arial" w:hAnsi="Arial" w:cs="Arial"/>
+              </w:rPr>
+              <w:t>Data</w:t>
+            </w:r>
+          </w:p>
+        </w:tc>
+        <w:tc>
+          <w:tcPr>
+            <w:tcW w:w="4831" w:type="dxa"/>
+            <w:tcBorders>
+              <w:top w:val="single" w:sz="4" w:space="0" w:color="auto"/>
+              <w:left w:val="single" w:sz="4" w:space="0" w:color="auto"/>
+              <w:bottom w:val="single" w:sz="4" w:space="0" w:color="auto"/>
+              <w:right w:val="single" w:sz="4" w:space="0" w:color="auto"/>
+            </w:tcBorders>
+            <w:vAlign w:val="center"/>
+            <w:hideMark/>
+          </w:tcPr>
+          <w:p>
+            <w:pPr>
+              <w:spacing w:after="200" w:line="276" w:lineRule="auto"/>
+              <w:rPr>
+                <w:rFonts w:ascii="Arial" w:hAnsi="Arial" w:cs="Arial"/>
+              </w:rPr>
+            </w:pPr>
+            <w:r>
+              <w:rPr>
+                <w:rFonts w:ascii="Arial" w:hAnsi="Arial" w:cs="Arial"/>
+              </w:rPr>
+              <w:t>27</w:t>
+            </w:r>
+            <w:r>
+              <w:rPr>
+                <w:rFonts w:ascii="Arial" w:hAnsi="Arial" w:cs="Arial"/>
+              </w:rPr>
+              <w:t>.03.2026</w:t>
+            </w:r>
+          </w:p>
+        </w:tc>
+      </w:tr>
+    </w:tbl>
+    <w:p>
+      <w:pPr>
+        <w:rPr>
+          <w:rFonts w:ascii="Arial" w:hAnsi="Arial" w:cs="Arial"/>
+        </w:rPr>
+      </w:pPr>
+    </w:p>
+    <w:tbl>
+      <w:tblPr>
+        <w:tblStyle w:val="Grigliatabella"/>
+        <w:tblW w:w="0" w:type="auto"/>
+        <w:tblLook w:val="04A0" w:firstRow="1" w:lastRow="0" w:firstColumn="1" w:lastColumn="0" w:noHBand="0" w:noVBand="1"/>
+      </w:tblPr>
+      <w:tblGrid>
+        <w:gridCol w:w="9628"/>
+      </w:tblGrid>
+      <w:tr>
+        <w:tc>
+          <w:tcPr>
+            <w:tcW w:w="9854" w:type="dxa"/>
+            <w:tcBorders>
+              <w:top w:val="single" w:sz="4" w:space="0" w:color="auto"/>
+              <w:left w:val="single" w:sz="4" w:space="0" w:color="auto"/>
+              <w:bottom w:val="single" w:sz="4" w:space="0" w:color="auto"/>
+              <w:right w:val="single" w:sz="4" w:space="0" w:color="auto"/>
+            </w:tcBorders>
+            <w:shd w:val="clear" w:color="auto" w:fill="D9D9D9" w:themeFill="background1" w:themeFillShade="D9"/>
+            <w:hideMark/>
+          </w:tcPr>
+          <w:p>
+            <w:pPr>
+              <w:spacing w:after="200" w:line="276" w:lineRule="auto"/>
+              <w:rPr>
+                <w:rFonts w:ascii="Arial" w:hAnsi="Arial" w:cs="Arial"/>
+              </w:rPr>
+            </w:pPr>
+            <w:r>
+              <w:rPr>
+                <w:rFonts w:ascii="Arial" w:hAnsi="Arial" w:cs="Arial"/>
+              </w:rPr>
+              <w:t>Lavori svolti</w:t>
+            </w:r>
+          </w:p>
+        </w:tc>
+      </w:tr>
+      <w:tr>
+        <w:tc>
+          <w:tcPr>
+            <w:tcW w:w="9854" w:type="dxa"/>
+            <w:tcBorders>
+              <w:top w:val="single" w:sz="4" w:space="0" w:color="auto"/>
+              <w:left w:val="single" w:sz="4" w:space="0" w:color="auto"/>
+              <w:bottom w:val="single" w:sz="4" w:space="0" w:color="auto"/>
+              <w:right w:val="single" w:sz="4" w:space="0" w:color="auto"/>
+            </w:tcBorders>
+            <w:hideMark/>
+          </w:tcPr>
+          <w:p>
+            <w:pPr>
+              <w:spacing w:after="200" w:line="276" w:lineRule="auto"/>
+              <w:rPr>
+                <w:rFonts w:ascii="Arial" w:hAnsi="Arial" w:cs="Arial"/>
+              </w:rPr>
+            </w:pPr>
+            <w:r>
+              <w:rPr>
+                <w:rFonts w:ascii="Arial" w:hAnsi="Arial" w:cs="Arial"/>
+              </w:rPr>
+              <w:t>Tessa:</w:t>
+            </w:r>
+          </w:p>
+          <w:p>
+            <w:pPr>
+              <w:numPr>
+                <w:ilvl w:val="0"/>
+                <w:numId w:val="31"/>
+              </w:numPr>
+              <w:spacing w:line="276" w:lineRule="auto"/>
+              <w:rPr>
+                <w:rFonts w:ascii="Arial" w:hAnsi="Arial" w:cs="Arial"/>
+              </w:rPr>
+            </w:pPr>
+            <w:r>
+              <w:rPr>
+                <w:rFonts w:ascii="Arial" w:hAnsi="Arial" w:cs="Arial"/>
+              </w:rPr>
+              <w:t>Possibilità di vedere la password dopo averla inserita (occhio)</w:t>
+            </w:r>
+          </w:p>
+          <w:p>
+            <w:pPr>
+              <w:numPr>
+                <w:ilvl w:val="0"/>
+                <w:numId w:val="31"/>
+              </w:numPr>
+              <w:spacing w:line="276" w:lineRule="auto"/>
+              <w:rPr>
+                <w:rFonts w:ascii="Arial" w:hAnsi="Arial" w:cs="Arial"/>
+              </w:rPr>
+            </w:pPr>
+            <w:r>
+              <w:rPr>
+                <w:rFonts w:ascii="Arial" w:hAnsi="Arial" w:cs="Arial"/>
+              </w:rPr>
+              <w:t>Conferma password</w:t>
+            </w:r>
+          </w:p>
+          <w:p>
+            <w:pPr>
+              <w:numPr>
+                <w:ilvl w:val="0"/>
+                <w:numId w:val="31"/>
+              </w:numPr>
+              <w:spacing w:line="276" w:lineRule="auto"/>
+              <w:rPr>
+                <w:rFonts w:ascii="Arial" w:hAnsi="Arial" w:cs="Arial"/>
+              </w:rPr>
+            </w:pPr>
+            <w:r>
+              <w:rPr>
+                <w:rFonts w:ascii="Arial" w:hAnsi="Arial" w:cs="Arial"/>
+              </w:rPr>
+              <w:t>Aggiunto email e telefono al login e alla registrazione</w:t>
+            </w:r>
+          </w:p>
+          <w:p>
+            <w:pPr>
+              <w:numPr>
+                <w:ilvl w:val="0"/>
+                <w:numId w:val="31"/>
+              </w:numPr>
+              <w:spacing w:line="276" w:lineRule="auto"/>
+              <w:rPr>
+                <w:rFonts w:ascii="Arial" w:hAnsi="Arial" w:cs="Arial"/>
+              </w:rPr>
+            </w:pPr>
+            <w:r>
+              <w:rPr>
+                <w:rFonts w:ascii="Arial" w:hAnsi="Arial" w:cs="Arial"/>
+              </w:rPr>
+              <w:t>Cambiato il datePicker (x la data di nascita) ad un massimo di 2008</w:t>
+            </w:r>
+          </w:p>
+          <w:p>
+            <w:pPr>
+              <w:spacing w:after="200" w:line="276" w:lineRule="auto"/>
+              <w:rPr>
+                <w:rFonts w:ascii="Arial" w:hAnsi="Arial" w:cs="Arial"/>
+              </w:rPr>
+            </w:pPr>
+            <w:r>
+              <w:rPr>
+                <w:rFonts w:ascii="Arial" w:hAnsi="Arial" w:cs="Arial"/>
+              </w:rPr>
+              <w:t>Ryan:</w:t>
+            </w:r>
+          </w:p>
+          <w:p>
+            <w:pPr>
+              <w:pStyle w:val="Paragrafoelenco"/>
+              <w:numPr>
+                <w:ilvl w:val="0"/>
+                <w:numId w:val="31"/>
+              </w:numPr>
+              <w:rPr>
+                <w:rFonts w:ascii="Arial" w:hAnsi="Arial" w:cs="Arial"/>
+              </w:rPr>
+            </w:pPr>
+            <w:r>
+              <w:rPr>
+                <w:rFonts w:ascii="Arial" w:hAnsi="Arial" w:cs="Arial"/>
+              </w:rPr>
+              <w:t xml:space="preserve">Barra di ricerca per titolo </w:t>
+            </w:r>
+            <w:r>
+              <w:rPr>
+                <w:rFonts w:ascii="Arial" w:hAnsi="Arial" w:cs="Arial"/>
+              </w:rPr>
+              <w:sym w:font="Wingdings" w:char="F0E0"/>
+            </w:r>
+            <w:r>
+              <w:rPr>
+                <w:rFonts w:ascii="Arial" w:hAnsi="Arial" w:cs="Arial"/>
+              </w:rPr>
+              <w:t xml:space="preserve"> funzionante</w:t>
+            </w:r>
+          </w:p>
+          <w:p>
+            <w:pPr>
+              <w:pStyle w:val="Paragrafoelenco"/>
+              <w:numPr>
+                <w:ilvl w:val="0"/>
+                <w:numId w:val="31"/>
+              </w:numPr>
+              <w:rPr>
+                <w:rFonts w:ascii="Arial" w:hAnsi="Arial" w:cs="Arial"/>
+              </w:rPr>
+            </w:pPr>
+            <w:r>
+              <w:rPr>
+                <w:rFonts w:ascii="Arial" w:hAnsi="Arial" w:cs="Arial"/>
+              </w:rPr>
+              <w:t>Click risultati della ricerca = porta a giorno dell’attività</w:t>
+            </w:r>
+          </w:p>
+          <w:p>
+            <w:pPr>
+              <w:pStyle w:val="Paragrafoelenco"/>
+              <w:numPr>
+                <w:ilvl w:val="0"/>
+                <w:numId w:val="31"/>
+              </w:numPr>
+              <w:rPr>
+                <w:rFonts w:ascii="Arial" w:hAnsi="Arial" w:cs="Arial"/>
+              </w:rPr>
+            </w:pPr>
+            <w:r>
+              <w:rPr>
+                <w:rFonts w:ascii="Arial" w:hAnsi="Arial" w:cs="Arial"/>
+              </w:rPr>
+              <w:t>Click attività dalla lista del giorno apre un overlay con le info dell’attività</w:t>
+            </w:r>
+          </w:p>
+          <w:p>
+            <w:pPr>
+              <w:rPr>
+                <w:rFonts w:ascii="Arial" w:hAnsi="Arial" w:cs="Arial"/>
+              </w:rPr>
+            </w:pPr>
+            <w:r>
+              <w:rPr>
+                <w:rFonts w:ascii="Arial" w:hAnsi="Arial" w:cs="Arial"/>
+              </w:rPr>
+              <w:t>Linda:</w:t>
+            </w:r>
+          </w:p>
+          <w:p>
+            <w:pPr>
+              <w:pStyle w:val="Paragrafoelenco"/>
+              <w:numPr>
+                <w:ilvl w:val="0"/>
+                <w:numId w:val="31"/>
+              </w:numPr>
+              <w:rPr>
+                <w:rFonts w:ascii="Arial" w:hAnsi="Arial" w:cs="Arial"/>
+              </w:rPr>
+            </w:pPr>
+            <w:r>
+              <w:rPr>
+                <w:rFonts w:ascii="Arial" w:hAnsi="Arial" w:cs="Arial"/>
+              </w:rPr>
+              <w:t>Iniziato Gantt consuntivo</w:t>
+            </w:r>
+          </w:p>
+          <w:p>
+            <w:pPr>
+              <w:pStyle w:val="Paragrafoelenco"/>
+              <w:numPr>
+                <w:ilvl w:val="0"/>
+                <w:numId w:val="31"/>
+              </w:numPr>
+              <w:rPr>
+                <w:rFonts w:ascii="Arial" w:hAnsi="Arial" w:cs="Arial"/>
+              </w:rPr>
+            </w:pPr>
+            <w:r>
+              <w:rPr>
+                <w:rFonts w:ascii="Arial" w:hAnsi="Arial" w:cs="Arial"/>
+              </w:rPr>
+              <w:t>Temi personalizzazione</w:t>
+            </w:r>
+          </w:p>
+          <w:p>
+            <w:pPr>
+              <w:pStyle w:val="Paragrafoelenco"/>
+              <w:numPr>
+                <w:ilvl w:val="0"/>
+                <w:numId w:val="31"/>
+              </w:numPr>
+              <w:rPr>
+                <w:rFonts w:ascii="Arial" w:hAnsi="Arial" w:cs="Arial"/>
+              </w:rPr>
+            </w:pPr>
+            <w:r>
+              <w:rPr>
+                <w:rFonts w:ascii="Arial" w:hAnsi="Arial" w:cs="Arial"/>
+              </w:rPr>
+              <w:t>P</w:t>
+            </w:r>
+            <w:r>
+              <w:rPr>
+                <w:rFonts w:ascii="Arial" w:hAnsi="Arial" w:cs="Arial"/>
+              </w:rPr>
+              <w:t>ersonalizzazione del calendario</w:t>
+            </w:r>
+          </w:p>
+        </w:tc>
+      </w:tr>
+    </w:tbl>
+    <w:p>
+      <w:pPr>
+        <w:rPr>
+          <w:rFonts w:ascii="Arial" w:hAnsi="Arial" w:cs="Arial"/>
+        </w:rPr>
+      </w:pPr>
+    </w:p>
+    <w:tbl>
+      <w:tblPr>
+        <w:tblStyle w:val="Grigliatabella"/>
+        <w:tblW w:w="0" w:type="auto"/>
+        <w:tblLook w:val="04A0" w:firstRow="1" w:lastRow="0" w:firstColumn="1" w:lastColumn="0" w:noHBand="0" w:noVBand="1"/>
+      </w:tblPr>
+      <w:tblGrid>
+        <w:gridCol w:w="9628"/>
+      </w:tblGrid>
+      <w:tr>
+        <w:tc>
+          <w:tcPr>
+            <w:tcW w:w="9854" w:type="dxa"/>
+            <w:tcBorders>
+              <w:top w:val="single" w:sz="4" w:space="0" w:color="auto"/>
+              <w:left w:val="single" w:sz="4" w:space="0" w:color="auto"/>
+              <w:bottom w:val="single" w:sz="4" w:space="0" w:color="auto"/>
+              <w:right w:val="single" w:sz="4" w:space="0" w:color="auto"/>
+            </w:tcBorders>
+            <w:shd w:val="clear" w:color="auto" w:fill="D9D9D9" w:themeFill="background1" w:themeFillShade="D9"/>
+            <w:hideMark/>
+          </w:tcPr>
+          <w:p>
+            <w:pPr>
+              <w:spacing w:after="200" w:line="276" w:lineRule="auto"/>
+              <w:rPr>
+                <w:rFonts w:ascii="Arial" w:hAnsi="Arial" w:cs="Arial"/>
+              </w:rPr>
+            </w:pPr>
+            <w:r>
+              <w:rPr>
+                <w:rFonts w:ascii="Arial" w:hAnsi="Arial" w:cs="Arial"/>
+              </w:rPr>
+              <w:t>Problemi riscontrati e soluzioni adottate</w:t>
+            </w:r>
+          </w:p>
+        </w:tc>
+      </w:tr>
+      <w:tr>
+        <w:tc>
+          <w:tcPr>
+            <w:tcW w:w="9854" w:type="dxa"/>
+            <w:tcBorders>
+              <w:top w:val="single" w:sz="4" w:space="0" w:color="auto"/>
+              <w:left w:val="single" w:sz="4" w:space="0" w:color="auto"/>
+              <w:bottom w:val="single" w:sz="4" w:space="0" w:color="auto"/>
+              <w:right w:val="single" w:sz="4" w:space="0" w:color="auto"/>
+            </w:tcBorders>
+          </w:tcPr>
+          <w:p>
+            <w:pPr>
+              <w:spacing w:after="200" w:line="276" w:lineRule="auto"/>
+              <w:rPr>
+                <w:rFonts w:ascii="Arial" w:hAnsi="Arial" w:cs="Arial"/>
+              </w:rPr>
+            </w:pPr>
+            <w:r>
+              <w:rPr>
+                <w:rFonts w:ascii="Arial" w:hAnsi="Arial" w:cs="Arial"/>
+              </w:rPr>
+              <w:t>Ryan:</w:t>
+            </w:r>
+          </w:p>
+          <w:p>
+            <w:pPr>
+              <w:pStyle w:val="Paragrafoelenco"/>
+              <w:numPr>
+                <w:ilvl w:val="0"/>
+                <w:numId w:val="31"/>
+              </w:numPr>
+              <w:rPr>
+                <w:rFonts w:ascii="Arial" w:hAnsi="Arial" w:cs="Arial"/>
+              </w:rPr>
+            </w:pPr>
+            <w:r>
+              <w:rPr>
+                <w:rFonts w:ascii="Arial" w:hAnsi="Arial" w:cs="Arial"/>
+              </w:rPr>
+              <w:t>Problema: quando si fa la ricerca esce sempre il testo “Nessun risultato” ma insieme ai risultati</w:t>
+            </w:r>
+          </w:p>
+          <w:p>
+            <w:pPr>
+              <w:pStyle w:val="Paragrafoelenco"/>
+              <w:numPr>
+                <w:ilvl w:val="0"/>
+                <w:numId w:val="31"/>
+              </w:numPr>
+              <w:rPr>
+                <w:rFonts w:ascii="Arial" w:hAnsi="Arial" w:cs="Arial"/>
+              </w:rPr>
+            </w:pPr>
+            <w:r>
+              <w:rPr>
+                <w:rFonts w:ascii="Arial" w:hAnsi="Arial" w:cs="Arial"/>
+              </w:rPr>
+              <w:t>Soluzione: sbagliato il controllo dei ciclo if</w:t>
+            </w:r>
+          </w:p>
+          <w:p>
+            <w:pPr>
+              <w:pStyle w:val="Paragrafoelenco"/>
+              <w:numPr>
+                <w:ilvl w:val="0"/>
+                <w:numId w:val="31"/>
+              </w:numPr>
+              <w:rPr>
+                <w:rFonts w:ascii="Arial" w:hAnsi="Arial" w:cs="Arial"/>
+              </w:rPr>
+            </w:pPr>
+            <w:r>
+              <w:rPr>
+                <w:rFonts w:ascii="Arial" w:hAnsi="Arial" w:cs="Arial"/>
+              </w:rPr>
+              <w:t>Problema 2: i risultati non portavano sul giorno</w:t>
+            </w:r>
+          </w:p>
+          <w:p>
+            <w:pPr>
+              <w:pStyle w:val="Paragrafoelenco"/>
+              <w:numPr>
+                <w:ilvl w:val="0"/>
+                <w:numId w:val="31"/>
+              </w:numPr>
+              <w:rPr>
+                <w:rFonts w:ascii="Arial" w:hAnsi="Arial" w:cs="Arial"/>
+              </w:rPr>
+            </w:pPr>
+            <w:r>
+              <w:rPr>
+                <w:rFonts w:ascii="Arial" w:hAnsi="Arial" w:cs="Arial"/>
+              </w:rPr>
+              <w:t>Soluzione 2: il nome della variabile era leggermente diverso da ciò che richiamava</w:t>
+            </w:r>
+          </w:p>
+          <w:p>
+            <w:pPr>
+              <w:rPr>
+                <w:rFonts w:ascii="Arial" w:hAnsi="Arial" w:cs="Arial"/>
+              </w:rPr>
+            </w:pPr>
+            <w:r>
+              <w:rPr>
+                <w:rFonts w:ascii="Arial" w:hAnsi="Arial" w:cs="Arial"/>
+              </w:rPr>
+              <w:t>Linda:</w:t>
+            </w:r>
+          </w:p>
+          <w:p>
+            <w:pPr>
+              <w:pStyle w:val="Paragrafoelenco"/>
+              <w:numPr>
+                <w:ilvl w:val="0"/>
+                <w:numId w:val="31"/>
+              </w:numPr>
+              <w:rPr>
+                <w:rFonts w:ascii="Arial" w:hAnsi="Arial" w:cs="Arial"/>
+              </w:rPr>
+            </w:pPr>
+            <w:r>
+              <w:rPr>
+                <w:rFonts w:ascii="Arial" w:hAnsi="Arial" w:cs="Arial"/>
+              </w:rPr>
+              <w:t>Problema: l’app non compilava</w:t>
+            </w:r>
+          </w:p>
+          <w:p>
+            <w:pPr>
+              <w:pStyle w:val="Paragrafoelenco"/>
+              <w:numPr>
+                <w:ilvl w:val="0"/>
+                <w:numId w:val="31"/>
+              </w:numPr>
+              <w:rPr>
+                <w:rFonts w:ascii="Arial" w:hAnsi="Arial" w:cs="Arial"/>
+              </w:rPr>
+            </w:pPr>
+            <w:r>
+              <w:rPr>
+                <w:rFonts w:ascii="Arial" w:hAnsi="Arial" w:cs="Arial"/>
+              </w:rPr>
+              <w:t>Soluzione: preso il progetto base da GitHub e rifatto (provate altre soluzioni ma non funzionavano) X 4 volte</w:t>
+            </w:r>
+          </w:p>
+          <w:p>
+            <w:pPr>
+              <w:pStyle w:val="Paragrafoelenco"/>
+              <w:numPr>
+                <w:ilvl w:val="0"/>
+                <w:numId w:val="31"/>
+              </w:numPr>
+              <w:rPr>
+                <w:rFonts w:ascii="Arial" w:hAnsi="Arial" w:cs="Arial"/>
+              </w:rPr>
+            </w:pPr>
+            <w:r>
+              <w:rPr>
+                <w:rFonts w:ascii="Arial" w:hAnsi="Arial" w:cs="Arial"/>
+              </w:rPr>
+              <w:t xml:space="preserve">Problema 2: non permette l’applicazione dei temi su tutte le pagine </w:t>
+            </w:r>
+            <w:r>
+              <w:rPr>
+                <w:rFonts w:ascii="Arial" w:hAnsi="Arial" w:cs="Arial"/>
+              </w:rPr>
+              <w:sym w:font="Wingdings" w:char="F0E0"/>
+            </w:r>
+            <w:r>
+              <w:rPr>
+                <w:rFonts w:ascii="Arial" w:hAnsi="Arial" w:cs="Arial"/>
+              </w:rPr>
+              <w:t xml:space="preserve"> si rompe tutto</w:t>
+            </w:r>
+          </w:p>
+          <w:p>
+            <w:pPr>
+              <w:pStyle w:val="Paragrafoelenco"/>
+              <w:numPr>
+                <w:ilvl w:val="0"/>
+                <w:numId w:val="31"/>
+              </w:numPr>
+              <w:rPr>
+                <w:rFonts w:ascii="Arial" w:hAnsi="Arial" w:cs="Arial"/>
+              </w:rPr>
+            </w:pPr>
+            <w:r>
+              <w:rPr>
+                <w:rFonts w:ascii="Arial" w:hAnsi="Arial" w:cs="Arial"/>
+              </w:rPr>
+              <w:t>Soluzione 2: non ancora trovata</w:t>
+            </w:r>
+          </w:p>
+          <w:p>
+            <w:pPr>
+              <w:rPr>
+                <w:rFonts w:ascii="Arial" w:hAnsi="Arial" w:cs="Arial"/>
+              </w:rPr>
+            </w:pPr>
+          </w:p>
+        </w:tc>
+      </w:tr>
+    </w:tbl>
+    <w:p>
+      <w:pPr>
+        <w:rPr>
+          <w:rFonts w:ascii="Arial" w:hAnsi="Arial" w:cs="Arial"/>
+        </w:rPr>
+      </w:pPr>
+    </w:p>
+    <w:tbl>
+      <w:tblPr>
+        <w:tblStyle w:val="Grigliatabella"/>
+        <w:tblW w:w="0" w:type="auto"/>
+        <w:tblLook w:val="04A0" w:firstRow="1" w:lastRow="0" w:firstColumn="1" w:lastColumn="0" w:noHBand="0" w:noVBand="1"/>
+      </w:tblPr>
+      <w:tblGrid>
+        <w:gridCol w:w="9628"/>
+      </w:tblGrid>
+      <w:tr>
+        <w:tc>
+          <w:tcPr>
+            <w:tcW w:w="9854" w:type="dxa"/>
+            <w:tcBorders>
+              <w:top w:val="single" w:sz="4" w:space="0" w:color="auto"/>
+              <w:left w:val="single" w:sz="4" w:space="0" w:color="auto"/>
+              <w:bottom w:val="single" w:sz="4" w:space="0" w:color="auto"/>
+              <w:right w:val="single" w:sz="4" w:space="0" w:color="auto"/>
+            </w:tcBorders>
+            <w:shd w:val="clear" w:color="auto" w:fill="D9D9D9" w:themeFill="background1" w:themeFillShade="D9"/>
+            <w:hideMark/>
+          </w:tcPr>
+          <w:p>
+            <w:pPr>
+              <w:spacing w:after="200" w:line="276" w:lineRule="auto"/>
+              <w:rPr>
+                <w:rFonts w:ascii="Arial" w:hAnsi="Arial" w:cs="Arial"/>
+              </w:rPr>
+            </w:pPr>
+            <w:r>
+              <w:rPr>
+                <w:rFonts w:ascii="Arial" w:hAnsi="Arial" w:cs="Arial"/>
+              </w:rPr>
+              <w:t>Punto della situazione rispetto alla pianificazione</w:t>
+            </w:r>
+          </w:p>
+        </w:tc>
+      </w:tr>
+      <w:tr>
+        <w:tc>
+          <w:tcPr>
+            <w:tcW w:w="9854" w:type="dxa"/>
+            <w:tcBorders>
+              <w:top w:val="single" w:sz="4" w:space="0" w:color="auto"/>
+              <w:left w:val="single" w:sz="4" w:space="0" w:color="auto"/>
+              <w:bottom w:val="single" w:sz="4" w:space="0" w:color="auto"/>
+              <w:right w:val="single" w:sz="4" w:space="0" w:color="auto"/>
+            </w:tcBorders>
+            <w:hideMark/>
+          </w:tcPr>
+          <w:p>
+            <w:pPr>
+              <w:spacing w:after="200" w:line="276" w:lineRule="auto"/>
+              <w:rPr>
+                <w:rFonts w:ascii="Arial" w:hAnsi="Arial" w:cs="Arial"/>
+              </w:rPr>
+            </w:pPr>
+            <w:r>
+              <w:rPr>
+                <w:rFonts w:ascii="Arial" w:hAnsi="Arial" w:cs="Arial"/>
+              </w:rPr>
+              <w:t xml:space="preserve">Implementazione </w:t>
+            </w:r>
+          </w:p>
+          <w:p>
+            <w:pPr>
+              <w:spacing w:after="200" w:line="276" w:lineRule="auto"/>
+              <w:rPr>
+                <w:rFonts w:ascii="Arial" w:hAnsi="Arial" w:cs="Arial"/>
+              </w:rPr>
+            </w:pPr>
+            <w:r>
+              <w:rPr>
+                <w:rFonts w:ascii="Arial" w:hAnsi="Arial" w:cs="Arial"/>
+              </w:rPr>
+              <w:t>Documentazione: leggermente in ritardo</w:t>
+            </w:r>
+          </w:p>
+        </w:tc>
+      </w:tr>
+    </w:tbl>
+    <w:p>
+      <w:pPr>
+        <w:rPr>
+          <w:rFonts w:ascii="Arial" w:hAnsi="Arial" w:cs="Arial"/>
+        </w:rPr>
+      </w:pPr>
+    </w:p>
+    <w:tbl>
+      <w:tblPr>
+        <w:tblStyle w:val="Grigliatabella"/>
+        <w:tblW w:w="0" w:type="auto"/>
+        <w:tblLook w:val="04A0" w:firstRow="1" w:lastRow="0" w:firstColumn="1" w:lastColumn="0" w:noHBand="0" w:noVBand="1"/>
+      </w:tblPr>
+      <w:tblGrid>
+        <w:gridCol w:w="9628"/>
+      </w:tblGrid>
+      <w:tr>
+        <w:tc>
+          <w:tcPr>
+            <w:tcW w:w="9854" w:type="dxa"/>
+            <w:tcBorders>
+              <w:top w:val="single" w:sz="4" w:space="0" w:color="auto"/>
+              <w:left w:val="single" w:sz="4" w:space="0" w:color="auto"/>
+              <w:bottom w:val="single" w:sz="4" w:space="0" w:color="auto"/>
+              <w:right w:val="single" w:sz="4" w:space="0" w:color="auto"/>
+            </w:tcBorders>
+            <w:shd w:val="clear" w:color="auto" w:fill="D9D9D9" w:themeFill="background1" w:themeFillShade="D9"/>
+            <w:hideMark/>
+          </w:tcPr>
+          <w:p>
+            <w:pPr>
+              <w:spacing w:after="200" w:line="276" w:lineRule="auto"/>
+              <w:rPr>
+                <w:rFonts w:ascii="Arial" w:hAnsi="Arial" w:cs="Arial"/>
+              </w:rPr>
+            </w:pPr>
+            <w:r>
+              <w:rPr>
+                <w:rFonts w:ascii="Arial" w:hAnsi="Arial" w:cs="Arial"/>
+              </w:rPr>
+              <w:t>Programma di massima per la prossima giornata di lavoro</w:t>
+            </w:r>
+          </w:p>
+        </w:tc>
+      </w:tr>
+      <w:tr>
+        <w:tc>
+          <w:tcPr>
+            <w:tcW w:w="9854" w:type="dxa"/>
+            <w:tcBorders>
+              <w:top w:val="single" w:sz="4" w:space="0" w:color="auto"/>
+              <w:left w:val="single" w:sz="4" w:space="0" w:color="auto"/>
+              <w:bottom w:val="single" w:sz="4" w:space="0" w:color="auto"/>
+              <w:right w:val="single" w:sz="4" w:space="0" w:color="auto"/>
+            </w:tcBorders>
+            <w:hideMark/>
+          </w:tcPr>
+          <w:p>
+            <w:pPr>
+              <w:numPr>
+                <w:ilvl w:val="0"/>
+                <w:numId w:val="31"/>
+              </w:numPr>
+              <w:spacing w:line="276" w:lineRule="auto"/>
+              <w:rPr>
+                <w:rFonts w:ascii="Arial" w:hAnsi="Arial" w:cs="Arial"/>
+              </w:rPr>
+            </w:pPr>
+            <w:r>
+              <w:rPr>
+                <w:rFonts w:ascii="Arial" w:hAnsi="Arial" w:cs="Arial"/>
+              </w:rPr>
+              <w:t xml:space="preserve">Unire le pagine </w:t>
+            </w:r>
+            <w:r>
+              <w:rPr>
+                <w:rFonts w:ascii="Arial" w:hAnsi="Arial" w:cs="Arial"/>
+              </w:rPr>
+              <w:sym w:font="Wingdings" w:char="F0E0"/>
+            </w:r>
+            <w:r>
+              <w:rPr>
+                <w:rFonts w:ascii="Arial" w:hAnsi="Arial" w:cs="Arial"/>
+              </w:rPr>
+              <w:t xml:space="preserve"> database a tutto</w:t>
+            </w:r>
+          </w:p>
+          <w:p>
+            <w:pPr>
+              <w:numPr>
+                <w:ilvl w:val="0"/>
+                <w:numId w:val="31"/>
+              </w:numPr>
+              <w:spacing w:line="276" w:lineRule="auto"/>
+              <w:rPr>
+                <w:rFonts w:ascii="Arial" w:hAnsi="Arial" w:cs="Arial"/>
+              </w:rPr>
+            </w:pPr>
+            <w:r>
+              <w:rPr>
+                <w:rFonts w:ascii="Arial" w:hAnsi="Arial" w:cs="Arial"/>
+              </w:rPr>
+              <w:t>Continuare Gantt Consuntivo</w:t>
+            </w:r>
+          </w:p>
+          <w:p>
+            <w:pPr>
+              <w:numPr>
+                <w:ilvl w:val="0"/>
+                <w:numId w:val="31"/>
+              </w:numPr>
+              <w:spacing w:line="276" w:lineRule="auto"/>
+              <w:rPr>
+                <w:rFonts w:ascii="Arial" w:hAnsi="Arial" w:cs="Arial"/>
+              </w:rPr>
+            </w:pPr>
+            <w:r>
+              <w:rPr>
+                <w:rFonts w:ascii="Arial" w:hAnsi="Arial" w:cs="Arial"/>
+              </w:rPr>
+              <w:t xml:space="preserve">Fare la documentazione </w:t>
+            </w:r>
+            <w:r>
+              <w:rPr>
+                <w:rFonts w:ascii="Arial" w:hAnsi="Arial" w:cs="Arial"/>
+              </w:rPr>
+              <w:sym w:font="Wingdings" w:char="F0E0"/>
+            </w:r>
+            <w:r>
+              <w:rPr>
+                <w:rFonts w:ascii="Arial" w:hAnsi="Arial" w:cs="Arial"/>
+              </w:rPr>
+              <w:t xml:space="preserve"> progettazione + spiegazione sprint</w:t>
+            </w:r>
+          </w:p>
+          <w:p>
+            <w:pPr>
+              <w:numPr>
+                <w:ilvl w:val="0"/>
+                <w:numId w:val="31"/>
+              </w:numPr>
+              <w:spacing w:line="276" w:lineRule="auto"/>
+              <w:rPr>
+                <w:rFonts w:ascii="Arial" w:hAnsi="Arial" w:cs="Arial"/>
+              </w:rPr>
+            </w:pPr>
+            <w:r>
+              <w:rPr>
+                <w:rFonts w:ascii="Arial" w:hAnsi="Arial" w:cs="Arial"/>
+              </w:rPr>
+              <w:t xml:space="preserve">Continuare il calendario </w:t>
+            </w:r>
+            <w:r>
+              <w:rPr>
+                <w:rFonts w:ascii="Arial" w:hAnsi="Arial" w:cs="Arial"/>
+              </w:rPr>
+              <w:sym w:font="Wingdings" w:char="F0E0"/>
+            </w:r>
+            <w:r>
+              <w:rPr>
+                <w:rFonts w:ascii="Arial" w:hAnsi="Arial" w:cs="Arial"/>
+              </w:rPr>
+              <w:t xml:space="preserve"> parametri per attività</w:t>
+            </w:r>
+          </w:p>
+          <w:p>
+            <w:pPr>
+              <w:numPr>
+                <w:ilvl w:val="0"/>
+                <w:numId w:val="31"/>
+              </w:numPr>
+              <w:spacing w:line="276" w:lineRule="auto"/>
+              <w:rPr>
+                <w:rFonts w:ascii="Arial" w:hAnsi="Arial" w:cs="Arial"/>
+              </w:rPr>
+            </w:pPr>
+            <w:r>
+              <w:rPr>
+                <w:rFonts w:ascii="Arial" w:hAnsi="Arial" w:cs="Arial"/>
+              </w:rPr>
+              <w:lastRenderedPageBreak/>
+              <w:t>Aggiungere tema a tutte le pagine</w:t>
+            </w:r>
+          </w:p>
+        </w:tc>
+      </w:tr>
+    </w:tbl>
+    <w:p>
+      <w:pPr>
+        <w:rPr>
+          <w:rFonts w:ascii="Arial" w:hAnsi="Arial" w:cs="Arial"/>
+        </w:rPr>
+      </w:pPr>
+    </w:p>
+    <w:p>
+      <w:pPr>
+        <w:rPr>
+          <w:rFonts w:ascii="Arial" w:hAnsi="Arial" w:cs="Arial"/>
+        </w:rPr>
+      </w:pPr>
+      <w:r>
+        <w:rPr>
+          <w:rFonts w:ascii="Arial" w:hAnsi="Arial" w:cs="Arial"/>
+        </w:rPr>
+        <w:t>Agile - Resoconto</w:t>
+      </w:r>
+    </w:p>
+    <w:p>
+      <w:pPr>
+        <w:rPr>
+          <w:rFonts w:ascii="Arial" w:hAnsi="Arial" w:cs="Arial"/>
+        </w:rPr>
+      </w:pPr>
+    </w:p>
+    <w:tbl>
+      <w:tblPr>
+        <w:tblStyle w:val="Grigliatabella"/>
+        <w:tblW w:w="0" w:type="auto"/>
+        <w:tblLook w:val="04A0" w:firstRow="1" w:lastRow="0" w:firstColumn="1" w:lastColumn="0" w:noHBand="0" w:noVBand="1"/>
+      </w:tblPr>
+      <w:tblGrid>
+        <w:gridCol w:w="9628"/>
+      </w:tblGrid>
+      <w:tr>
+        <w:tc>
+          <w:tcPr>
+            <w:tcW w:w="9854" w:type="dxa"/>
+            <w:tcBorders>
+              <w:top w:val="single" w:sz="4" w:space="0" w:color="auto"/>
+              <w:left w:val="single" w:sz="4" w:space="0" w:color="auto"/>
+              <w:bottom w:val="single" w:sz="4" w:space="0" w:color="auto"/>
+              <w:right w:val="single" w:sz="4" w:space="0" w:color="auto"/>
+            </w:tcBorders>
+            <w:shd w:val="clear" w:color="auto" w:fill="D9D9D9" w:themeFill="background1" w:themeFillShade="D9"/>
+            <w:hideMark/>
+          </w:tcPr>
+          <w:p>
+            <w:pPr>
+              <w:spacing w:after="200" w:line="276" w:lineRule="auto"/>
+              <w:rPr>
+                <w:rFonts w:ascii="Arial" w:hAnsi="Arial" w:cs="Arial"/>
+              </w:rPr>
+            </w:pPr>
+            <w:r>
+              <w:rPr>
+                <w:rFonts w:ascii="Arial" w:hAnsi="Arial" w:cs="Arial"/>
+              </w:rPr>
+              <w:t>Daily Scrum</w:t>
+            </w:r>
+          </w:p>
+        </w:tc>
+      </w:tr>
+      <w:tr>
+        <w:tc>
+          <w:tcPr>
+            <w:tcW w:w="9854" w:type="dxa"/>
+            <w:tcBorders>
+              <w:top w:val="single" w:sz="4" w:space="0" w:color="auto"/>
+              <w:left w:val="single" w:sz="4" w:space="0" w:color="auto"/>
+              <w:bottom w:val="single" w:sz="4" w:space="0" w:color="auto"/>
+              <w:right w:val="single" w:sz="4" w:space="0" w:color="auto"/>
+            </w:tcBorders>
+            <w:hideMark/>
+          </w:tcPr>
+          <w:p>
+            <w:pPr>
+              <w:numPr>
+                <w:ilvl w:val="0"/>
+                <w:numId w:val="31"/>
+              </w:numPr>
+              <w:spacing w:line="276" w:lineRule="auto"/>
+              <w:rPr>
+                <w:rFonts w:ascii="Arial" w:hAnsi="Arial" w:cs="Arial"/>
+              </w:rPr>
+            </w:pPr>
+            <w:r>
+              <w:rPr>
+                <w:rFonts w:ascii="Arial" w:hAnsi="Arial" w:cs="Arial"/>
+              </w:rPr>
+              <w:t>9:00</w:t>
+            </w:r>
+          </w:p>
+          <w:p>
+            <w:pPr>
+              <w:numPr>
+                <w:ilvl w:val="0"/>
+                <w:numId w:val="31"/>
+              </w:numPr>
+              <w:spacing w:line="276" w:lineRule="auto"/>
+              <w:rPr>
+                <w:rFonts w:ascii="Arial" w:hAnsi="Arial" w:cs="Arial"/>
+              </w:rPr>
+            </w:pPr>
+            <w:r>
+              <w:rPr>
+                <w:rFonts w:ascii="Arial" w:hAnsi="Arial" w:cs="Arial"/>
+              </w:rPr>
+              <w:t>Non sono emersi problemi rilevanti</w:t>
+            </w:r>
+          </w:p>
+          <w:p>
+            <w:pPr>
+              <w:numPr>
+                <w:ilvl w:val="0"/>
+                <w:numId w:val="31"/>
+              </w:numPr>
+              <w:spacing w:line="276" w:lineRule="auto"/>
+              <w:rPr>
+                <w:rFonts w:ascii="Arial" w:hAnsi="Arial" w:cs="Arial"/>
+              </w:rPr>
+            </w:pPr>
+            <w:r>
+              <w:rPr>
+                <w:rFonts w:ascii="Arial" w:hAnsi="Arial" w:cs="Arial"/>
+              </w:rPr>
+              <w:t xml:space="preserve">Discussione sul review </w:t>
+            </w:r>
+            <w:r>
+              <w:rPr>
+                <w:rFonts w:ascii="Arial" w:hAnsi="Arial" w:cs="Arial"/>
+              </w:rPr>
+              <w:sym w:font="Wingdings" w:char="F0E0"/>
+            </w:r>
+            <w:r>
+              <w:rPr>
+                <w:rFonts w:ascii="Arial" w:hAnsi="Arial" w:cs="Arial"/>
+              </w:rPr>
+              <w:t xml:space="preserve"> presentarlo alla prof</w:t>
+            </w:r>
+          </w:p>
+        </w:tc>
+      </w:tr>
+    </w:tbl>
+    <w:p>
+      <w:pPr>
+        <w:rPr>
+          <w:rFonts w:ascii="Arial" w:hAnsi="Arial" w:cs="Arial"/>
+        </w:rPr>
+      </w:pPr>
+    </w:p>
+    <w:tbl>
+      <w:tblPr>
+        <w:tblStyle w:val="Grigliatabella"/>
+        <w:tblW w:w="0" w:type="auto"/>
+        <w:tblLook w:val="04A0" w:firstRow="1" w:lastRow="0" w:firstColumn="1" w:lastColumn="0" w:noHBand="0" w:noVBand="1"/>
+      </w:tblPr>
+      <w:tblGrid>
+        <w:gridCol w:w="9628"/>
+      </w:tblGrid>
+      <w:tr>
+        <w:tc>
+          <w:tcPr>
+            <w:tcW w:w="9854" w:type="dxa"/>
+            <w:tcBorders>
+              <w:top w:val="single" w:sz="4" w:space="0" w:color="auto"/>
+              <w:left w:val="single" w:sz="4" w:space="0" w:color="auto"/>
+              <w:bottom w:val="single" w:sz="4" w:space="0" w:color="auto"/>
+              <w:right w:val="single" w:sz="4" w:space="0" w:color="auto"/>
+            </w:tcBorders>
+            <w:shd w:val="clear" w:color="auto" w:fill="D9D9D9" w:themeFill="background1" w:themeFillShade="D9"/>
+            <w:hideMark/>
+          </w:tcPr>
+          <w:p>
+            <w:pPr>
+              <w:spacing w:after="200" w:line="276" w:lineRule="auto"/>
+              <w:rPr>
+                <w:rFonts w:ascii="Arial" w:hAnsi="Arial" w:cs="Arial"/>
+              </w:rPr>
+            </w:pPr>
+            <w:r>
+              <w:rPr>
+                <w:rFonts w:ascii="Arial" w:hAnsi="Arial" w:cs="Arial"/>
+              </w:rPr>
+              <w:t>Sprint Planning</w:t>
+            </w:r>
+          </w:p>
+        </w:tc>
+      </w:tr>
+      <w:tr>
+        <w:tc>
+          <w:tcPr>
+            <w:tcW w:w="9854" w:type="dxa"/>
+            <w:tcBorders>
+              <w:top w:val="single" w:sz="4" w:space="0" w:color="auto"/>
+              <w:left w:val="single" w:sz="4" w:space="0" w:color="auto"/>
+              <w:bottom w:val="single" w:sz="4" w:space="0" w:color="auto"/>
+              <w:right w:val="single" w:sz="4" w:space="0" w:color="auto"/>
+            </w:tcBorders>
+          </w:tcPr>
+          <w:p>
+            <w:pPr>
+              <w:spacing w:after="200" w:line="276" w:lineRule="auto"/>
+              <w:rPr>
+                <w:rFonts w:ascii="Arial" w:hAnsi="Arial" w:cs="Arial"/>
+              </w:rPr>
+            </w:pPr>
+          </w:p>
+        </w:tc>
+      </w:tr>
+    </w:tbl>
+    <w:p>
+      <w:pPr>
+        <w:rPr>
+          <w:rFonts w:ascii="Arial" w:hAnsi="Arial" w:cs="Arial"/>
+        </w:rPr>
+      </w:pPr>
+    </w:p>
+    <w:tbl>
+      <w:tblPr>
+        <w:tblStyle w:val="Grigliatabella"/>
+        <w:tblW w:w="0" w:type="auto"/>
+        <w:tblLook w:val="04A0" w:firstRow="1" w:lastRow="0" w:firstColumn="1" w:lastColumn="0" w:noHBand="0" w:noVBand="1"/>
+      </w:tblPr>
+      <w:tblGrid>
+        <w:gridCol w:w="9628"/>
+      </w:tblGrid>
+      <w:tr>
+        <w:tc>
+          <w:tcPr>
+            <w:tcW w:w="9854" w:type="dxa"/>
+            <w:tcBorders>
+              <w:top w:val="single" w:sz="4" w:space="0" w:color="auto"/>
+              <w:left w:val="single" w:sz="4" w:space="0" w:color="auto"/>
+              <w:bottom w:val="single" w:sz="4" w:space="0" w:color="auto"/>
+              <w:right w:val="single" w:sz="4" w:space="0" w:color="auto"/>
+            </w:tcBorders>
+            <w:shd w:val="clear" w:color="auto" w:fill="D9D9D9" w:themeFill="background1" w:themeFillShade="D9"/>
+            <w:hideMark/>
+          </w:tcPr>
+          <w:p>
+            <w:pPr>
+              <w:spacing w:after="200" w:line="276" w:lineRule="auto"/>
+              <w:rPr>
+                <w:rFonts w:ascii="Arial" w:hAnsi="Arial" w:cs="Arial"/>
+              </w:rPr>
+            </w:pPr>
+            <w:r>
+              <w:rPr>
+                <w:rFonts w:ascii="Arial" w:hAnsi="Arial" w:cs="Arial"/>
+              </w:rPr>
+              <w:t>Sprint Review</w:t>
+            </w:r>
+          </w:p>
+        </w:tc>
+      </w:tr>
+      <w:tr>
+        <w:tc>
+          <w:tcPr>
+            <w:tcW w:w="9854" w:type="dxa"/>
+            <w:tcBorders>
+              <w:top w:val="single" w:sz="4" w:space="0" w:color="auto"/>
+              <w:left w:val="single" w:sz="4" w:space="0" w:color="auto"/>
+              <w:bottom w:val="single" w:sz="4" w:space="0" w:color="auto"/>
+              <w:right w:val="single" w:sz="4" w:space="0" w:color="auto"/>
+            </w:tcBorders>
+          </w:tcPr>
+          <w:p>
+            <w:pPr>
+              <w:spacing w:after="200" w:line="276" w:lineRule="auto"/>
+              <w:rPr>
+                <w:rFonts w:ascii="Arial" w:hAnsi="Arial" w:cs="Arial"/>
+              </w:rPr>
+            </w:pPr>
+            <w:r>
+              <w:rPr>
+                <w:rFonts w:ascii="Arial" w:hAnsi="Arial" w:cs="Arial"/>
+              </w:rPr>
+              <w:t>Note soressa:</w:t>
+            </w:r>
+          </w:p>
+          <w:p>
+            <w:pPr>
+              <w:pStyle w:val="Paragrafoelenco"/>
+              <w:numPr>
+                <w:ilvl w:val="0"/>
+                <w:numId w:val="31"/>
+              </w:numPr>
+              <w:rPr>
+                <w:rFonts w:ascii="Arial" w:hAnsi="Arial" w:cs="Arial"/>
+              </w:rPr>
+            </w:pPr>
+            <w:r>
+              <w:rPr>
+                <w:rFonts w:ascii="Arial" w:hAnsi="Arial" w:cs="Arial"/>
+              </w:rPr>
+              <w:t>Aggiungere la possibilità di vedere la password prima di confermare</w:t>
+            </w:r>
+          </w:p>
+          <w:p>
+            <w:pPr>
+              <w:pStyle w:val="Paragrafoelenco"/>
+              <w:numPr>
+                <w:ilvl w:val="0"/>
+                <w:numId w:val="31"/>
+              </w:numPr>
+              <w:rPr>
+                <w:rFonts w:ascii="Arial" w:hAnsi="Arial" w:cs="Arial"/>
+              </w:rPr>
+            </w:pPr>
+            <w:r>
+              <w:rPr>
+                <w:rFonts w:ascii="Arial" w:hAnsi="Arial" w:cs="Arial"/>
+              </w:rPr>
+              <w:t>Doppio inserimento password</w:t>
+            </w:r>
+          </w:p>
+          <w:p>
+            <w:pPr>
+              <w:pStyle w:val="Paragrafoelenco"/>
+              <w:numPr>
+                <w:ilvl w:val="0"/>
+                <w:numId w:val="31"/>
+              </w:numPr>
+              <w:rPr>
+                <w:rFonts w:ascii="Arial" w:hAnsi="Arial" w:cs="Arial"/>
+              </w:rPr>
+            </w:pPr>
+            <w:r>
+              <w:rPr>
+                <w:rFonts w:ascii="Arial" w:hAnsi="Arial" w:cs="Arial"/>
+              </w:rPr>
+              <w:t xml:space="preserve">Data di nascita da cambiare </w:t>
+            </w:r>
+            <w:r>
+              <w:rPr>
+                <w:rFonts w:ascii="Arial" w:hAnsi="Arial" w:cs="Arial"/>
+              </w:rPr>
+              <w:sym w:font="Wingdings" w:char="F0E0"/>
+            </w:r>
+            <w:r>
+              <w:rPr>
+                <w:rFonts w:ascii="Arial" w:hAnsi="Arial" w:cs="Arial"/>
+              </w:rPr>
+              <w:t xml:space="preserve"> o farla partire dal 2008 o metterla testuale</w:t>
+            </w:r>
+          </w:p>
+          <w:p>
+            <w:pPr>
+              <w:pStyle w:val="Paragrafoelenco"/>
+              <w:numPr>
+                <w:ilvl w:val="0"/>
+                <w:numId w:val="31"/>
+              </w:numPr>
+              <w:rPr>
+                <w:rFonts w:ascii="Arial" w:hAnsi="Arial" w:cs="Arial"/>
+              </w:rPr>
+            </w:pPr>
+            <w:r>
+              <w:rPr>
+                <w:rFonts w:ascii="Arial" w:hAnsi="Arial" w:cs="Arial"/>
+              </w:rPr>
+              <w:t>Primary key nel database per lo username</w:t>
+            </w:r>
+          </w:p>
+          <w:p>
+            <w:pPr>
+              <w:pStyle w:val="Paragrafoelenco"/>
+              <w:numPr>
+                <w:ilvl w:val="0"/>
+                <w:numId w:val="31"/>
+              </w:numPr>
+              <w:rPr>
+                <w:rFonts w:ascii="Arial" w:hAnsi="Arial" w:cs="Arial"/>
+              </w:rPr>
+            </w:pPr>
+            <w:r>
+              <w:rPr>
+                <w:rFonts w:ascii="Arial" w:hAnsi="Arial" w:cs="Arial"/>
+              </w:rPr>
+              <w:t>Scrivere sprint nella progettazione</w:t>
+            </w:r>
+          </w:p>
+          <w:p>
+            <w:pPr>
+              <w:pStyle w:val="Paragrafoelenco"/>
+              <w:numPr>
+                <w:ilvl w:val="0"/>
+                <w:numId w:val="31"/>
+              </w:numPr>
+              <w:rPr>
+                <w:rFonts w:ascii="Arial" w:hAnsi="Arial" w:cs="Arial"/>
+              </w:rPr>
+            </w:pPr>
+            <w:r>
+              <w:rPr>
+                <w:rFonts w:ascii="Arial" w:hAnsi="Arial" w:cs="Arial"/>
+              </w:rPr>
+              <w:t>Togliere modifica dello username nel profilo</w:t>
+            </w:r>
+          </w:p>
+          <w:p>
+            <w:pPr>
+              <w:pStyle w:val="Paragrafoelenco"/>
+              <w:numPr>
+                <w:ilvl w:val="0"/>
+                <w:numId w:val="31"/>
+              </w:numPr>
+              <w:rPr>
+                <w:rFonts w:ascii="Arial" w:hAnsi="Arial" w:cs="Arial"/>
+              </w:rPr>
+            </w:pPr>
+            <w:r>
+              <w:rPr>
+                <w:rFonts w:ascii="Arial" w:hAnsi="Arial" w:cs="Arial"/>
+              </w:rPr>
+              <w:t xml:space="preserve">Fare il programma o in italiano o inglese </w:t>
+            </w:r>
+            <w:r>
+              <w:rPr>
+                <w:rFonts w:ascii="Arial" w:hAnsi="Arial" w:cs="Arial"/>
+              </w:rPr>
+              <w:sym w:font="Wingdings" w:char="F0E0"/>
+            </w:r>
+            <w:r>
+              <w:rPr>
+                <w:rFonts w:ascii="Arial" w:hAnsi="Arial" w:cs="Arial"/>
+              </w:rPr>
+              <w:t xml:space="preserve"> No Mix</w:t>
+            </w:r>
+          </w:p>
+          <w:p>
+            <w:pPr>
+              <w:pStyle w:val="Paragrafoelenco"/>
+              <w:numPr>
+                <w:ilvl w:val="0"/>
+                <w:numId w:val="31"/>
+              </w:numPr>
+              <w:rPr>
+                <w:rFonts w:ascii="Arial" w:hAnsi="Arial" w:cs="Arial"/>
+              </w:rPr>
+            </w:pPr>
+            <w:r>
+              <w:rPr>
+                <w:rFonts w:ascii="Arial" w:hAnsi="Arial" w:cs="Arial"/>
+              </w:rPr>
+              <w:t>Valutare ordine Task</w:t>
+            </w:r>
+          </w:p>
+          <w:p>
+            <w:pPr>
+              <w:pStyle w:val="Paragrafoelenco"/>
+              <w:numPr>
+                <w:ilvl w:val="0"/>
+                <w:numId w:val="31"/>
+              </w:numPr>
+              <w:rPr>
+                <w:rFonts w:ascii="Arial" w:hAnsi="Arial" w:cs="Arial"/>
+              </w:rPr>
+            </w:pPr>
+            <w:r>
+              <w:rPr>
+                <w:rFonts w:ascii="Arial" w:hAnsi="Arial" w:cs="Arial"/>
+              </w:rPr>
+              <w:t>Valutazione: 3.9</w:t>
+            </w:r>
+          </w:p>
+        </w:tc>
+      </w:tr>
+    </w:tbl>
+    <w:p>
+      <w:pPr>
+        <w:rPr>
+          <w:rFonts w:ascii="Arial" w:hAnsi="Arial" w:cs="Arial"/>
+        </w:rPr>
+      </w:pPr>
+    </w:p>
+    <w:tbl>
+      <w:tblPr>
+        <w:tblStyle w:val="Grigliatabella"/>
+        <w:tblW w:w="0" w:type="auto"/>
+        <w:tblLook w:val="04A0" w:firstRow="1" w:lastRow="0" w:firstColumn="1" w:lastColumn="0" w:noHBand="0" w:noVBand="1"/>
+      </w:tblPr>
+      <w:tblGrid>
+        <w:gridCol w:w="9628"/>
+      </w:tblGrid>
+      <w:tr>
+        <w:tc>
+          <w:tcPr>
+            <w:tcW w:w="9854" w:type="dxa"/>
+            <w:tcBorders>
+              <w:top w:val="single" w:sz="4" w:space="0" w:color="auto"/>
+              <w:left w:val="single" w:sz="4" w:space="0" w:color="auto"/>
+              <w:bottom w:val="single" w:sz="4" w:space="0" w:color="auto"/>
+              <w:right w:val="single" w:sz="4" w:space="0" w:color="auto"/>
+            </w:tcBorders>
+            <w:shd w:val="clear" w:color="auto" w:fill="D9D9D9" w:themeFill="background1" w:themeFillShade="D9"/>
+            <w:hideMark/>
+          </w:tcPr>
+          <w:p>
+            <w:pPr>
+              <w:spacing w:after="200" w:line="276" w:lineRule="auto"/>
+              <w:rPr>
+                <w:rFonts w:ascii="Arial" w:hAnsi="Arial" w:cs="Arial"/>
+              </w:rPr>
+            </w:pPr>
+            <w:r>
+              <w:rPr>
+                <w:rFonts w:ascii="Arial" w:hAnsi="Arial" w:cs="Arial"/>
+              </w:rPr>
+              <w:t>Sprint Retrospective</w:t>
+            </w:r>
+          </w:p>
+        </w:tc>
+      </w:tr>
+      <w:tr>
+        <w:tc>
+          <w:tcPr>
+            <w:tcW w:w="9854" w:type="dxa"/>
+            <w:tcBorders>
+              <w:top w:val="single" w:sz="4" w:space="0" w:color="auto"/>
+              <w:left w:val="single" w:sz="4" w:space="0" w:color="auto"/>
+              <w:bottom w:val="single" w:sz="4" w:space="0" w:color="auto"/>
+              <w:right w:val="single" w:sz="4" w:space="0" w:color="auto"/>
+            </w:tcBorders>
+          </w:tcPr>
+          <w:p>
+            <w:pPr>
+              <w:pStyle w:val="Paragrafoelenco"/>
+              <w:numPr>
+                <w:ilvl w:val="0"/>
+                <w:numId w:val="31"/>
+              </w:numPr>
+              <w:rPr>
+                <w:rFonts w:ascii="Arial" w:hAnsi="Arial" w:cs="Arial"/>
+              </w:rPr>
+            </w:pPr>
+            <w:r>
+              <w:rPr>
+                <w:rFonts w:ascii="Arial" w:hAnsi="Arial" w:cs="Arial"/>
+              </w:rPr>
+              <w:t>Tutte le user stories sono</w:t>
+            </w:r>
+            <w:r>
+              <w:rPr>
+                <w:rFonts w:ascii="Arial" w:hAnsi="Arial" w:cs="Arial"/>
+              </w:rPr>
+              <w:t xml:space="preserve"> parzialmente completate perché i profili non sono stati ancora uniti perciò la pagina di calendario e di profilo non ha un database</w:t>
+            </w:r>
+          </w:p>
+          <w:p>
+            <w:pPr>
+              <w:pStyle w:val="Paragrafoelenco"/>
+              <w:numPr>
+                <w:ilvl w:val="0"/>
+                <w:numId w:val="31"/>
+              </w:numPr>
+              <w:rPr>
+                <w:rFonts w:ascii="Arial" w:hAnsi="Arial" w:cs="Arial"/>
+              </w:rPr>
+            </w:pPr>
+            <w:r>
+              <w:rPr>
+                <w:rFonts w:ascii="Arial" w:hAnsi="Arial" w:cs="Arial"/>
+              </w:rPr>
+              <w:t>Nel prossimo Sprint avere già tutto unito</w:t>
+            </w:r>
+          </w:p>
+          <w:p>
+            <w:pPr>
+              <w:pStyle w:val="Paragrafoelenco"/>
+              <w:numPr>
+                <w:ilvl w:val="0"/>
+                <w:numId w:val="31"/>
+              </w:numPr>
+              <w:rPr>
+                <w:rFonts w:ascii="Arial" w:hAnsi="Arial" w:cs="Arial"/>
+              </w:rPr>
+            </w:pPr>
+            <w:r>
+              <w:rPr>
+                <w:rFonts w:ascii="Arial" w:hAnsi="Arial" w:cs="Arial"/>
+              </w:rPr>
+              <w:t>Sistemare ciò che la soressa ha notato</w:t>
+            </w:r>
+          </w:p>
+          <w:p>
+            <w:pPr>
+              <w:pStyle w:val="Paragrafoelenco"/>
+              <w:numPr>
+                <w:ilvl w:val="0"/>
+                <w:numId w:val="31"/>
+              </w:numPr>
+              <w:rPr>
+                <w:rFonts w:ascii="Arial" w:hAnsi="Arial" w:cs="Arial"/>
+              </w:rPr>
+            </w:pPr>
+            <w:r>
+              <w:rPr>
+                <w:rFonts w:ascii="Arial" w:hAnsi="Arial" w:cs="Arial"/>
+              </w:rPr>
+              <w:t>Sperare che .NET MAUI non dia più problemi con la compilazione</w:t>
+            </w:r>
+          </w:p>
+        </w:tc>
+      </w:tr>
+    </w:tbl>
+    <w:p>
+      <w:pPr>
+        <w:rPr>
+          <w:rFonts w:ascii="Arial" w:hAnsi="Arial" w:cs="Arial"/>
+        </w:rPr>
+      </w:pPr>
+    </w:p>
+    <w:p>
+      <w:pPr>
+        <w:rPr>
+          <w:rFonts w:ascii="Arial" w:hAnsi="Arial" w:cs="Arial"/>
+        </w:rPr>
+      </w:pPr>
+      <w:r>
+        <w:rPr>
+          <w:rFonts w:ascii="Arial" w:hAnsi="Arial" w:cs="Arial"/>
+        </w:rPr>
+        <w:br w:type="page"/>
+      </w:r>
+    </w:p>
+    <w:tbl>
+      <w:tblPr>
+        <w:tblStyle w:val="Grigliatabella"/>
+        <w:tblW w:w="9634" w:type="dxa"/>
+        <w:tblLook w:val="04A0" w:firstRow="1" w:lastRow="0" w:firstColumn="1" w:lastColumn="0" w:noHBand="0" w:noVBand="1"/>
+      </w:tblPr>
+      <w:tblGrid>
+        <w:gridCol w:w="4803"/>
+        <w:gridCol w:w="4831"/>
+      </w:tblGrid>
+      <w:tr>
+        <w:trPr>
+          <w:trHeight w:hRule="exact" w:val="397"/>
+        </w:trPr>
+        <w:tc>
+          <w:tcPr>
+            <w:tcW w:w="4803" w:type="dxa"/>
+            <w:tcBorders>
+              <w:top w:val="single" w:sz="4" w:space="0" w:color="auto"/>
+              <w:left w:val="single" w:sz="4" w:space="0" w:color="auto"/>
+              <w:bottom w:val="single" w:sz="4" w:space="0" w:color="auto"/>
+              <w:right w:val="single" w:sz="4" w:space="0" w:color="auto"/>
+            </w:tcBorders>
+            <w:vAlign w:val="center"/>
+            <w:hideMark/>
+          </w:tcPr>
+          <w:p>
+            <w:pPr>
+              <w:spacing w:after="200" w:line="276" w:lineRule="auto"/>
+              <w:rPr>
+                <w:rFonts w:ascii="Arial" w:hAnsi="Arial" w:cs="Arial"/>
+              </w:rPr>
+            </w:pPr>
+            <w:r>
+              <w:rPr>
+                <w:rFonts w:ascii="Arial" w:hAnsi="Arial" w:cs="Arial"/>
+              </w:rPr>
+              <w:lastRenderedPageBreak/>
+              <w:t>Luogo</w:t>
+            </w:r>
+          </w:p>
+        </w:tc>
+        <w:tc>
+          <w:tcPr>
+            <w:tcW w:w="4831" w:type="dxa"/>
+            <w:tcBorders>
+              <w:top w:val="single" w:sz="4" w:space="0" w:color="auto"/>
+              <w:left w:val="single" w:sz="4" w:space="0" w:color="auto"/>
+              <w:bottom w:val="single" w:sz="4" w:space="0" w:color="auto"/>
+              <w:right w:val="single" w:sz="4" w:space="0" w:color="auto"/>
+            </w:tcBorders>
+            <w:vAlign w:val="center"/>
+            <w:hideMark/>
+          </w:tcPr>
+          <w:p>
+            <w:pPr>
+              <w:spacing w:after="200" w:line="276" w:lineRule="auto"/>
+              <w:rPr>
+                <w:rFonts w:ascii="Arial" w:hAnsi="Arial" w:cs="Arial"/>
+              </w:rPr>
+            </w:pPr>
+            <w:r>
+              <w:rPr>
+                <w:rFonts w:ascii="Arial" w:hAnsi="Arial" w:cs="Arial"/>
+              </w:rPr>
+              <w:t>Canobbio</w:t>
+            </w:r>
+          </w:p>
+        </w:tc>
+      </w:tr>
+      <w:tr>
+        <w:trPr>
+          <w:trHeight w:hRule="exact" w:val="397"/>
+        </w:trPr>
+        <w:tc>
+          <w:tcPr>
+            <w:tcW w:w="4803" w:type="dxa"/>
+            <w:tcBorders>
+              <w:top w:val="single" w:sz="4" w:space="0" w:color="auto"/>
+              <w:left w:val="single" w:sz="4" w:space="0" w:color="auto"/>
+              <w:bottom w:val="single" w:sz="4" w:space="0" w:color="auto"/>
+              <w:right w:val="single" w:sz="4" w:space="0" w:color="auto"/>
+            </w:tcBorders>
+            <w:vAlign w:val="center"/>
+            <w:hideMark/>
+          </w:tcPr>
+          <w:p>
+            <w:pPr>
+              <w:spacing w:after="200" w:line="276" w:lineRule="auto"/>
+              <w:rPr>
+                <w:rFonts w:ascii="Arial" w:hAnsi="Arial" w:cs="Arial"/>
+              </w:rPr>
+            </w:pPr>
+            <w:r>
+              <w:rPr>
+                <w:rFonts w:ascii="Arial" w:hAnsi="Arial" w:cs="Arial"/>
+              </w:rPr>
+              <w:t>Data</w:t>
+            </w:r>
+          </w:p>
+        </w:tc>
+        <w:tc>
+          <w:tcPr>
+            <w:tcW w:w="4831" w:type="dxa"/>
+            <w:tcBorders>
+              <w:top w:val="single" w:sz="4" w:space="0" w:color="auto"/>
+              <w:left w:val="single" w:sz="4" w:space="0" w:color="auto"/>
+              <w:bottom w:val="single" w:sz="4" w:space="0" w:color="auto"/>
+              <w:right w:val="single" w:sz="4" w:space="0" w:color="auto"/>
+            </w:tcBorders>
+            <w:vAlign w:val="center"/>
+            <w:hideMark/>
+          </w:tcPr>
+          <w:p>
+            <w:pPr>
+              <w:spacing w:after="200" w:line="276" w:lineRule="auto"/>
+              <w:rPr>
+                <w:rFonts w:ascii="Arial" w:hAnsi="Arial" w:cs="Arial"/>
+              </w:rPr>
+            </w:pPr>
+            <w:r>
+              <w:rPr>
+                <w:rFonts w:ascii="Arial" w:hAnsi="Arial" w:cs="Arial"/>
+              </w:rPr>
+              <w:t>28</w:t>
+            </w:r>
+            <w:r>
+              <w:rPr>
+                <w:rFonts w:ascii="Arial" w:hAnsi="Arial" w:cs="Arial"/>
+              </w:rPr>
+              <w:t>.03.2026</w:t>
+            </w:r>
+          </w:p>
+        </w:tc>
+      </w:tr>
+    </w:tbl>
+    <w:p>
+      <w:pPr>
+        <w:rPr>
+          <w:rFonts w:ascii="Arial" w:hAnsi="Arial" w:cs="Arial"/>
+        </w:rPr>
+      </w:pPr>
+    </w:p>
+    <w:tbl>
+      <w:tblPr>
+        <w:tblStyle w:val="Grigliatabella"/>
+        <w:tblW w:w="0" w:type="auto"/>
+        <w:tblLook w:val="04A0" w:firstRow="1" w:lastRow="0" w:firstColumn="1" w:lastColumn="0" w:noHBand="0" w:noVBand="1"/>
+      </w:tblPr>
+      <w:tblGrid>
+        <w:gridCol w:w="9628"/>
+      </w:tblGrid>
+      <w:tr>
+        <w:tc>
+          <w:tcPr>
+            <w:tcW w:w="9854" w:type="dxa"/>
+            <w:tcBorders>
+              <w:top w:val="single" w:sz="4" w:space="0" w:color="auto"/>
+              <w:left w:val="single" w:sz="4" w:space="0" w:color="auto"/>
+              <w:bottom w:val="single" w:sz="4" w:space="0" w:color="auto"/>
+              <w:right w:val="single" w:sz="4" w:space="0" w:color="auto"/>
+            </w:tcBorders>
+            <w:shd w:val="clear" w:color="auto" w:fill="D9D9D9" w:themeFill="background1" w:themeFillShade="D9"/>
+            <w:hideMark/>
+          </w:tcPr>
+          <w:p>
+            <w:pPr>
+              <w:spacing w:after="200" w:line="276" w:lineRule="auto"/>
+              <w:rPr>
+                <w:rFonts w:ascii="Arial" w:hAnsi="Arial" w:cs="Arial"/>
+              </w:rPr>
+            </w:pPr>
+            <w:r>
+              <w:rPr>
+                <w:rFonts w:ascii="Arial" w:hAnsi="Arial" w:cs="Arial"/>
+              </w:rPr>
+              <w:t>Lavori svolti</w:t>
+            </w:r>
+          </w:p>
+        </w:tc>
+      </w:tr>
+      <w:tr>
+        <w:tc>
+          <w:tcPr>
+            <w:tcW w:w="9854" w:type="dxa"/>
+            <w:tcBorders>
+              <w:top w:val="single" w:sz="4" w:space="0" w:color="auto"/>
+              <w:left w:val="single" w:sz="4" w:space="0" w:color="auto"/>
+              <w:bottom w:val="single" w:sz="4" w:space="0" w:color="auto"/>
+              <w:right w:val="single" w:sz="4" w:space="0" w:color="auto"/>
+            </w:tcBorders>
+            <w:hideMark/>
+          </w:tcPr>
+          <w:p>
+            <w:pPr>
+              <w:spacing w:after="200" w:line="276" w:lineRule="auto"/>
+              <w:rPr>
+                <w:rFonts w:ascii="Arial" w:hAnsi="Arial" w:cs="Arial"/>
+              </w:rPr>
+            </w:pPr>
+            <w:r>
+              <w:rPr>
+                <w:rFonts w:ascii="Arial" w:hAnsi="Arial" w:cs="Arial"/>
+              </w:rPr>
+              <w:t>Ryan</w:t>
+            </w:r>
+            <w:r>
+              <w:rPr>
+                <w:rFonts w:ascii="Arial" w:hAnsi="Arial" w:cs="Arial"/>
+              </w:rPr>
+              <w:t xml:space="preserve"> (9:30-13:00)</w:t>
+            </w:r>
+            <w:r>
+              <w:rPr>
+                <w:rFonts w:ascii="Arial" w:hAnsi="Arial" w:cs="Arial"/>
+              </w:rPr>
+              <w:t>:</w:t>
+            </w:r>
+          </w:p>
+          <w:p>
+            <w:pPr>
+              <w:pStyle w:val="Paragrafoelenco"/>
+              <w:numPr>
+                <w:ilvl w:val="0"/>
+                <w:numId w:val="31"/>
+              </w:numPr>
+              <w:rPr>
+                <w:rFonts w:ascii="Arial" w:hAnsi="Arial" w:cs="Arial"/>
+              </w:rPr>
+            </w:pPr>
+            <w:r>
+              <w:rPr>
+                <w:rFonts w:ascii="Arial" w:hAnsi="Arial" w:cs="Arial"/>
+              </w:rPr>
+              <w:t>Sistemato bug del titolo durante l’inserimento delle attività</w:t>
+            </w:r>
+            <w:r>
+              <w:rPr>
+                <w:rFonts w:ascii="Arial" w:hAnsi="Arial" w:cs="Arial"/>
+              </w:rPr>
+              <w:t>.</w:t>
+            </w:r>
+          </w:p>
+          <w:p>
+            <w:pPr>
+              <w:pStyle w:val="Paragrafoelenco"/>
+              <w:numPr>
+                <w:ilvl w:val="0"/>
+                <w:numId w:val="31"/>
+              </w:numPr>
+              <w:rPr>
+                <w:rFonts w:ascii="Arial" w:hAnsi="Arial" w:cs="Arial"/>
+              </w:rPr>
+            </w:pPr>
+            <w:r>
+              <w:rPr>
+                <w:rFonts w:ascii="Arial" w:hAnsi="Arial" w:cs="Arial"/>
+              </w:rPr>
+              <w:t>Aggiunta data selezionata di default.</w:t>
+            </w:r>
+          </w:p>
+          <w:p>
+            <w:pPr>
+              <w:pStyle w:val="Paragrafoelenco"/>
+              <w:numPr>
+                <w:ilvl w:val="0"/>
+                <w:numId w:val="31"/>
+              </w:numPr>
+              <w:rPr>
+                <w:rFonts w:ascii="Arial" w:hAnsi="Arial" w:cs="Arial"/>
+              </w:rPr>
+            </w:pPr>
+            <w:r>
+              <w:rPr>
+                <w:rFonts w:ascii="Arial" w:hAnsi="Arial" w:cs="Arial"/>
+              </w:rPr>
+              <w:t>Leggermente sistemata la barra di ricerca aggiungendo un Trim per pulire il valore di ricerca.</w:t>
+            </w:r>
+          </w:p>
+          <w:p>
+            <w:pPr>
+              <w:pStyle w:val="Paragrafoelenco"/>
+              <w:numPr>
+                <w:ilvl w:val="0"/>
+                <w:numId w:val="31"/>
+              </w:numPr>
+              <w:rPr>
+                <w:rFonts w:ascii="Arial" w:hAnsi="Arial" w:cs="Arial"/>
+              </w:rPr>
+            </w:pPr>
+            <w:r>
+              <w:rPr>
+                <w:rFonts w:ascii="Arial" w:hAnsi="Arial" w:cs="Arial"/>
+              </w:rPr>
+              <w:t>Documentazione iniziale dell’implementazione</w:t>
+            </w:r>
+          </w:p>
+        </w:tc>
+      </w:tr>
+    </w:tbl>
+    <w:p>
+      <w:pPr>
+        <w:rPr>
+          <w:rFonts w:ascii="Arial" w:hAnsi="Arial" w:cs="Arial"/>
+        </w:rPr>
+      </w:pPr>
+    </w:p>
+    <w:tbl>
+      <w:tblPr>
+        <w:tblStyle w:val="Grigliatabella"/>
+        <w:tblW w:w="0" w:type="auto"/>
+        <w:tblLook w:val="04A0" w:firstRow="1" w:lastRow="0" w:firstColumn="1" w:lastColumn="0" w:noHBand="0" w:noVBand="1"/>
+      </w:tblPr>
+      <w:tblGrid>
+        <w:gridCol w:w="9628"/>
+      </w:tblGrid>
+      <w:tr>
+        <w:tc>
+          <w:tcPr>
+            <w:tcW w:w="9854" w:type="dxa"/>
+            <w:tcBorders>
+              <w:top w:val="single" w:sz="4" w:space="0" w:color="auto"/>
+              <w:left w:val="single" w:sz="4" w:space="0" w:color="auto"/>
+              <w:bottom w:val="single" w:sz="4" w:space="0" w:color="auto"/>
+              <w:right w:val="single" w:sz="4" w:space="0" w:color="auto"/>
+            </w:tcBorders>
+            <w:shd w:val="clear" w:color="auto" w:fill="D9D9D9" w:themeFill="background1" w:themeFillShade="D9"/>
+            <w:hideMark/>
+          </w:tcPr>
+          <w:p>
+            <w:pPr>
+              <w:spacing w:after="200" w:line="276" w:lineRule="auto"/>
+              <w:rPr>
+                <w:rFonts w:ascii="Arial" w:hAnsi="Arial" w:cs="Arial"/>
+              </w:rPr>
+            </w:pPr>
+            <w:r>
+              <w:rPr>
+                <w:rFonts w:ascii="Arial" w:hAnsi="Arial" w:cs="Arial"/>
+              </w:rPr>
+              <w:t>Problemi riscontrati e soluzioni adottate</w:t>
+            </w:r>
+          </w:p>
+        </w:tc>
+      </w:tr>
+      <w:tr>
+        <w:tc>
+          <w:tcPr>
+            <w:tcW w:w="9854" w:type="dxa"/>
+            <w:tcBorders>
+              <w:top w:val="single" w:sz="4" w:space="0" w:color="auto"/>
+              <w:left w:val="single" w:sz="4" w:space="0" w:color="auto"/>
+              <w:bottom w:val="single" w:sz="4" w:space="0" w:color="auto"/>
+              <w:right w:val="single" w:sz="4" w:space="0" w:color="auto"/>
+            </w:tcBorders>
+          </w:tcPr>
+          <w:p>
+            <w:pPr>
+              <w:spacing w:after="200" w:line="276" w:lineRule="auto"/>
+              <w:rPr>
+                <w:rFonts w:ascii="Arial" w:hAnsi="Arial" w:cs="Arial"/>
+              </w:rPr>
+            </w:pPr>
+            <w:r>
+              <w:rPr>
+                <w:rFonts w:ascii="Arial" w:hAnsi="Arial" w:cs="Arial"/>
+              </w:rPr>
+              <w:t>Ryan:</w:t>
+            </w:r>
+          </w:p>
+          <w:p>
+            <w:pPr>
+              <w:pStyle w:val="Paragrafoelenco"/>
+              <w:numPr>
+                <w:ilvl w:val="0"/>
+                <w:numId w:val="31"/>
+              </w:numPr>
+              <w:rPr>
+                <w:rFonts w:ascii="Arial" w:hAnsi="Arial" w:cs="Arial"/>
+              </w:rPr>
+            </w:pPr>
+            <w:r>
+              <w:rPr>
+                <w:rFonts w:ascii="Arial" w:hAnsi="Arial" w:cs="Arial"/>
+              </w:rPr>
+              <w:t xml:space="preserve">Problema: quando provavo ad inserire </w:t>
+            </w:r>
+            <w:r>
+              <w:rPr>
+                <w:rFonts w:ascii="Arial" w:hAnsi="Arial" w:cs="Arial"/>
+              </w:rPr>
+              <w:t>un’attività</w:t>
+            </w:r>
+            <w:r>
+              <w:rPr>
+                <w:rFonts w:ascii="Arial" w:hAnsi="Arial" w:cs="Arial"/>
+              </w:rPr>
+              <w:t xml:space="preserve"> senza neanche cliccare sul campo del titolo mi dava che il campo ritornava Null, anche dopo aver messo il controllo del campo Null. Soluzione: </w:t>
+            </w:r>
+            <w:r>
+              <w:rPr>
+                <w:rFonts w:ascii="Arial" w:hAnsi="Arial" w:cs="Arial"/>
+              </w:rPr>
+              <w:t>Mettere il controllo per vedere se il campo fosse null prima di controllare se il campo di testo fosse una stringa vuota.</w:t>
+            </w:r>
+          </w:p>
+          <w:p>
+            <w:pPr>
+              <w:pStyle w:val="Paragrafoelenco"/>
+              <w:numPr>
+                <w:ilvl w:val="0"/>
+                <w:numId w:val="31"/>
+              </w:numPr>
+              <w:rPr>
+                <w:rFonts w:ascii="Arial" w:hAnsi="Arial" w:cs="Arial"/>
+              </w:rPr>
+            </w:pPr>
+            <w:r>
+              <w:rPr>
+                <w:rFonts w:ascii="Arial" w:hAnsi="Arial" w:cs="Arial"/>
+              </w:rPr>
+              <w:t xml:space="preserve">Problema: Il controllo della data di fine sembra non funzionare, quando metto una data di fine prima della data selezionata il programma si frizza per circa 20 secondi per poi mettere l’attività. Soluzione: </w:t>
+            </w:r>
+            <w:r>
+              <w:rPr>
+                <w:rFonts w:ascii="Arial" w:hAnsi="Arial" w:cs="Arial"/>
+              </w:rPr>
+              <w:t xml:space="preserve">Di default la data selezionata del calendario è il primo gennaio dell’anno 1, quindi quando aggiungo </w:t>
+            </w:r>
+            <w:r>
+              <w:rPr>
+                <w:rFonts w:ascii="Arial" w:hAnsi="Arial" w:cs="Arial"/>
+              </w:rPr>
+              <w:t>un’attività</w:t>
+            </w:r>
+            <w:r>
+              <w:rPr>
+                <w:rFonts w:ascii="Arial" w:hAnsi="Arial" w:cs="Arial"/>
+              </w:rPr>
+              <w:t xml:space="preserve"> senza selezionare a mano il giorno, aggiunge l’attività per tutti i giorni dall’anno 1 fino ad oggi, quindi ho messo come data selezionata di default il giorno attuale</w:t>
+            </w:r>
+            <w:r>
+              <w:rPr>
+                <w:rFonts w:ascii="Arial" w:hAnsi="Arial" w:cs="Arial"/>
+              </w:rPr>
+              <w:t>.</w:t>
+            </w:r>
+          </w:p>
+        </w:tc>
+      </w:tr>
+    </w:tbl>
+    <w:p>
+      <w:pPr>
+        <w:rPr>
+          <w:rFonts w:ascii="Arial" w:hAnsi="Arial" w:cs="Arial"/>
+        </w:rPr>
+      </w:pPr>
+    </w:p>
+    <w:tbl>
+      <w:tblPr>
+        <w:tblStyle w:val="Grigliatabella"/>
+        <w:tblW w:w="0" w:type="auto"/>
+        <w:tblLook w:val="04A0" w:firstRow="1" w:lastRow="0" w:firstColumn="1" w:lastColumn="0" w:noHBand="0" w:noVBand="1"/>
+      </w:tblPr>
+      <w:tblGrid>
+        <w:gridCol w:w="9628"/>
+      </w:tblGrid>
+      <w:tr>
+        <w:tc>
+          <w:tcPr>
+            <w:tcW w:w="9854" w:type="dxa"/>
+            <w:tcBorders>
+              <w:top w:val="single" w:sz="4" w:space="0" w:color="auto"/>
+              <w:left w:val="single" w:sz="4" w:space="0" w:color="auto"/>
+              <w:bottom w:val="single" w:sz="4" w:space="0" w:color="auto"/>
+              <w:right w:val="single" w:sz="4" w:space="0" w:color="auto"/>
+            </w:tcBorders>
+            <w:shd w:val="clear" w:color="auto" w:fill="D9D9D9" w:themeFill="background1" w:themeFillShade="D9"/>
+            <w:hideMark/>
+          </w:tcPr>
+          <w:p>
+            <w:pPr>
+              <w:spacing w:after="200" w:line="276" w:lineRule="auto"/>
+              <w:rPr>
+                <w:rFonts w:ascii="Arial" w:hAnsi="Arial" w:cs="Arial"/>
+              </w:rPr>
+            </w:pPr>
+            <w:r>
+              <w:rPr>
+                <w:rFonts w:ascii="Arial" w:hAnsi="Arial" w:cs="Arial"/>
+              </w:rPr>
+              <w:t>Punto della situazione rispetto alla pianificazione</w:t>
+            </w:r>
+          </w:p>
+        </w:tc>
+      </w:tr>
+      <w:tr>
+        <w:tc>
+          <w:tcPr>
+            <w:tcW w:w="9854" w:type="dxa"/>
+            <w:tcBorders>
+              <w:top w:val="single" w:sz="4" w:space="0" w:color="auto"/>
+              <w:left w:val="single" w:sz="4" w:space="0" w:color="auto"/>
+              <w:bottom w:val="single" w:sz="4" w:space="0" w:color="auto"/>
+              <w:right w:val="single" w:sz="4" w:space="0" w:color="auto"/>
+            </w:tcBorders>
+            <w:hideMark/>
+          </w:tcPr>
+          <w:p>
+            <w:pPr>
+              <w:spacing w:after="200" w:line="276" w:lineRule="auto"/>
+              <w:rPr>
+                <w:rFonts w:ascii="Arial" w:hAnsi="Arial" w:cs="Arial"/>
+              </w:rPr>
+            </w:pPr>
+            <w:r>
+              <w:rPr>
+                <w:rFonts w:ascii="Arial" w:hAnsi="Arial" w:cs="Arial"/>
+              </w:rPr>
+              <w:t xml:space="preserve">Implementazione </w:t>
+            </w:r>
+          </w:p>
+          <w:p>
+            <w:pPr>
+              <w:spacing w:after="200" w:line="276" w:lineRule="auto"/>
+              <w:rPr>
+                <w:rFonts w:ascii="Arial" w:hAnsi="Arial" w:cs="Arial"/>
+              </w:rPr>
+            </w:pPr>
+            <w:r>
+              <w:rPr>
+                <w:rFonts w:ascii="Arial" w:hAnsi="Arial" w:cs="Arial"/>
+              </w:rPr>
+              <w:t>Documentazione: leggermente in ritardo</w:t>
+            </w:r>
+          </w:p>
+        </w:tc>
+      </w:tr>
+    </w:tbl>
+    <w:p>
+      <w:pPr>
+        <w:rPr>
+          <w:rFonts w:ascii="Arial" w:hAnsi="Arial" w:cs="Arial"/>
+        </w:rPr>
+      </w:pPr>
+    </w:p>
+    <w:tbl>
+      <w:tblPr>
+        <w:tblStyle w:val="Grigliatabella"/>
+        <w:tblW w:w="0" w:type="auto"/>
+        <w:tblLook w:val="04A0" w:firstRow="1" w:lastRow="0" w:firstColumn="1" w:lastColumn="0" w:noHBand="0" w:noVBand="1"/>
+      </w:tblPr>
+      <w:tblGrid>
+        <w:gridCol w:w="9628"/>
+      </w:tblGrid>
+      <w:tr>
+        <w:tc>
+          <w:tcPr>
+            <w:tcW w:w="9854" w:type="dxa"/>
+            <w:tcBorders>
+              <w:top w:val="single" w:sz="4" w:space="0" w:color="auto"/>
+              <w:left w:val="single" w:sz="4" w:space="0" w:color="auto"/>
+              <w:bottom w:val="single" w:sz="4" w:space="0" w:color="auto"/>
+              <w:right w:val="single" w:sz="4" w:space="0" w:color="auto"/>
+            </w:tcBorders>
+            <w:shd w:val="clear" w:color="auto" w:fill="D9D9D9" w:themeFill="background1" w:themeFillShade="D9"/>
+            <w:hideMark/>
+          </w:tcPr>
+          <w:p>
+            <w:pPr>
+              <w:spacing w:after="200" w:line="276" w:lineRule="auto"/>
+              <w:rPr>
+                <w:rFonts w:ascii="Arial" w:hAnsi="Arial" w:cs="Arial"/>
+              </w:rPr>
+            </w:pPr>
+            <w:r>
+              <w:rPr>
+                <w:rFonts w:ascii="Arial" w:hAnsi="Arial" w:cs="Arial"/>
+              </w:rPr>
+              <w:t>Programma di massima per la prossima giornata di lavoro</w:t>
+            </w:r>
+          </w:p>
+        </w:tc>
+      </w:tr>
+      <w:tr>
+        <w:tc>
+          <w:tcPr>
+            <w:tcW w:w="9854" w:type="dxa"/>
+            <w:tcBorders>
+              <w:top w:val="single" w:sz="4" w:space="0" w:color="auto"/>
+              <w:left w:val="single" w:sz="4" w:space="0" w:color="auto"/>
+              <w:bottom w:val="single" w:sz="4" w:space="0" w:color="auto"/>
+              <w:right w:val="single" w:sz="4" w:space="0" w:color="auto"/>
+            </w:tcBorders>
+            <w:hideMark/>
+          </w:tcPr>
+          <w:p>
+            <w:pPr>
+              <w:numPr>
+                <w:ilvl w:val="0"/>
+                <w:numId w:val="31"/>
+              </w:numPr>
+              <w:spacing w:line="276" w:lineRule="auto"/>
+              <w:rPr>
+                <w:rFonts w:ascii="Arial" w:hAnsi="Arial" w:cs="Arial"/>
+              </w:rPr>
+            </w:pPr>
+            <w:r>
+              <w:rPr>
+                <w:rFonts w:ascii="Arial" w:hAnsi="Arial" w:cs="Arial"/>
+              </w:rPr>
+              <w:t xml:space="preserve">Unire le pagine </w:t>
+            </w:r>
+            <w:r>
+              <w:rPr>
+                <w:rFonts w:ascii="Arial" w:hAnsi="Arial" w:cs="Arial"/>
+              </w:rPr>
+              <w:sym w:font="Wingdings" w:char="F0E0"/>
+            </w:r>
+            <w:r>
+              <w:rPr>
+                <w:rFonts w:ascii="Arial" w:hAnsi="Arial" w:cs="Arial"/>
+              </w:rPr>
+              <w:t xml:space="preserve"> database a tutto</w:t>
+            </w:r>
+          </w:p>
+          <w:p>
+            <w:pPr>
+              <w:numPr>
+                <w:ilvl w:val="0"/>
+                <w:numId w:val="31"/>
+              </w:numPr>
+              <w:spacing w:line="276" w:lineRule="auto"/>
+              <w:rPr>
+                <w:rFonts w:ascii="Arial" w:hAnsi="Arial" w:cs="Arial"/>
+              </w:rPr>
+            </w:pPr>
+            <w:r>
+              <w:rPr>
+                <w:rFonts w:ascii="Arial" w:hAnsi="Arial" w:cs="Arial"/>
+              </w:rPr>
+              <w:t>Continuare Gantt Consuntivo</w:t>
+            </w:r>
+          </w:p>
+          <w:p>
+            <w:pPr>
+              <w:numPr>
+                <w:ilvl w:val="0"/>
+                <w:numId w:val="31"/>
+              </w:numPr>
+              <w:spacing w:line="276" w:lineRule="auto"/>
+              <w:rPr>
+                <w:rFonts w:ascii="Arial" w:hAnsi="Arial" w:cs="Arial"/>
+              </w:rPr>
+            </w:pPr>
+            <w:r>
+              <w:rPr>
+                <w:rFonts w:ascii="Arial" w:hAnsi="Arial" w:cs="Arial"/>
+              </w:rPr>
+              <w:t xml:space="preserve">Fare la documentazione </w:t>
+            </w:r>
+            <w:r>
+              <w:rPr>
+                <w:rFonts w:ascii="Arial" w:hAnsi="Arial" w:cs="Arial"/>
+              </w:rPr>
+              <w:sym w:font="Wingdings" w:char="F0E0"/>
+            </w:r>
+            <w:r>
+              <w:rPr>
+                <w:rFonts w:ascii="Arial" w:hAnsi="Arial" w:cs="Arial"/>
+              </w:rPr>
+              <w:t xml:space="preserve"> progettazione + spiegazione sprint</w:t>
+            </w:r>
+          </w:p>
+          <w:p>
+            <w:pPr>
+              <w:numPr>
+                <w:ilvl w:val="0"/>
+                <w:numId w:val="31"/>
+              </w:numPr>
+              <w:spacing w:line="276" w:lineRule="auto"/>
+              <w:rPr>
+                <w:rFonts w:ascii="Arial" w:hAnsi="Arial" w:cs="Arial"/>
+              </w:rPr>
+            </w:pPr>
+            <w:r>
+              <w:rPr>
+                <w:rFonts w:ascii="Arial" w:hAnsi="Arial" w:cs="Arial"/>
+              </w:rPr>
+              <w:t xml:space="preserve">Continuare il calendario </w:t>
+            </w:r>
+            <w:r>
+              <w:rPr>
+                <w:rFonts w:ascii="Arial" w:hAnsi="Arial" w:cs="Arial"/>
+              </w:rPr>
+              <w:sym w:font="Wingdings" w:char="F0E0"/>
+            </w:r>
+            <w:r>
+              <w:rPr>
+                <w:rFonts w:ascii="Arial" w:hAnsi="Arial" w:cs="Arial"/>
+              </w:rPr>
+              <w:t xml:space="preserve"> parametri per attività</w:t>
+            </w:r>
+          </w:p>
+          <w:p>
+            <w:pPr>
+              <w:numPr>
+                <w:ilvl w:val="0"/>
+                <w:numId w:val="31"/>
+              </w:numPr>
+              <w:spacing w:line="276" w:lineRule="auto"/>
+              <w:rPr>
+                <w:rFonts w:ascii="Arial" w:hAnsi="Arial" w:cs="Arial"/>
+              </w:rPr>
+            </w:pPr>
+            <w:r>
+              <w:rPr>
+                <w:rFonts w:ascii="Arial" w:hAnsi="Arial" w:cs="Arial"/>
+              </w:rPr>
+              <w:t>Aggiungere tema a tutte le pagine</w:t>
+            </w:r>
+          </w:p>
+        </w:tc>
+      </w:tr>
+    </w:tbl>
+    <w:p>
+      <w:pPr>
+        <w:rPr>
+          <w:rFonts w:ascii="Arial" w:hAnsi="Arial" w:cs="Arial"/>
+        </w:rPr>
+      </w:pPr>
+    </w:p>
+    <w:p>
+      <w:pPr>
+        <w:rPr>
+          <w:rFonts w:ascii="Arial" w:hAnsi="Arial" w:cs="Arial"/>
+        </w:rPr>
+      </w:pPr>
+      <w:r>
+        <w:rPr>
+          <w:rFonts w:ascii="Arial" w:hAnsi="Arial" w:cs="Arial"/>
+        </w:rPr>
+        <w:t>Agile - Resoconto</w:t>
+      </w:r>
+    </w:p>
+    <w:p>
+      <w:pPr>
+        <w:rPr>
+          <w:rFonts w:ascii="Arial" w:hAnsi="Arial" w:cs="Arial"/>
+        </w:rPr>
+      </w:pPr>
+    </w:p>
+    <w:tbl>
+      <w:tblPr>
+        <w:tblStyle w:val="Grigliatabella"/>
+        <w:tblW w:w="0" w:type="auto"/>
+        <w:tblLook w:val="04A0" w:firstRow="1" w:lastRow="0" w:firstColumn="1" w:lastColumn="0" w:noHBand="0" w:noVBand="1"/>
+      </w:tblPr>
+      <w:tblGrid>
+        <w:gridCol w:w="9628"/>
+      </w:tblGrid>
+      <w:tr>
+        <w:tc>
+          <w:tcPr>
+            <w:tcW w:w="9854" w:type="dxa"/>
+            <w:tcBorders>
+              <w:top w:val="single" w:sz="4" w:space="0" w:color="auto"/>
+              <w:left w:val="single" w:sz="4" w:space="0" w:color="auto"/>
+              <w:bottom w:val="single" w:sz="4" w:space="0" w:color="auto"/>
+              <w:right w:val="single" w:sz="4" w:space="0" w:color="auto"/>
+            </w:tcBorders>
+            <w:shd w:val="clear" w:color="auto" w:fill="D9D9D9" w:themeFill="background1" w:themeFillShade="D9"/>
+            <w:hideMark/>
+          </w:tcPr>
+          <w:p>
+            <w:pPr>
+              <w:spacing w:after="200" w:line="276" w:lineRule="auto"/>
+              <w:rPr>
+                <w:rFonts w:ascii="Arial" w:hAnsi="Arial" w:cs="Arial"/>
+              </w:rPr>
+            </w:pPr>
+            <w:r>
+              <w:rPr>
+                <w:rFonts w:ascii="Arial" w:hAnsi="Arial" w:cs="Arial"/>
+              </w:rPr>
+              <w:t>Daily Scrum</w:t>
+            </w:r>
+          </w:p>
+        </w:tc>
+      </w:tr>
+      <w:tr>
+        <w:tc>
+          <w:tcPr>
+            <w:tcW w:w="9854" w:type="dxa"/>
+            <w:tcBorders>
+              <w:top w:val="single" w:sz="4" w:space="0" w:color="auto"/>
+              <w:left w:val="single" w:sz="4" w:space="0" w:color="auto"/>
+              <w:bottom w:val="single" w:sz="4" w:space="0" w:color="auto"/>
+              <w:right w:val="single" w:sz="4" w:space="0" w:color="auto"/>
+            </w:tcBorders>
+            <w:hideMark/>
+          </w:tcPr>
+          <w:p>
+            <w:pPr>
+              <w:numPr>
+                <w:ilvl w:val="0"/>
+                <w:numId w:val="31"/>
+              </w:numPr>
+              <w:spacing w:line="276" w:lineRule="auto"/>
+              <w:rPr>
+                <w:rFonts w:ascii="Arial" w:hAnsi="Arial" w:cs="Arial"/>
+              </w:rPr>
+            </w:pPr>
+            <w:r>
+              <w:rPr>
+                <w:rFonts w:ascii="Arial" w:hAnsi="Arial" w:cs="Arial"/>
+              </w:rPr>
+              <w:t>9:35</w:t>
+            </w:r>
+          </w:p>
+          <w:p>
+            <w:pPr>
+              <w:numPr>
+                <w:ilvl w:val="0"/>
+                <w:numId w:val="31"/>
+              </w:numPr>
+              <w:spacing w:line="276" w:lineRule="auto"/>
+              <w:rPr>
+                <w:rFonts w:ascii="Arial" w:hAnsi="Arial" w:cs="Arial"/>
+              </w:rPr>
+            </w:pPr>
+            <w:r>
+              <w:rPr>
+                <w:rFonts w:ascii="Arial" w:hAnsi="Arial" w:cs="Arial"/>
+              </w:rPr>
+              <w:t>Non sono emersi problemi rilevanti</w:t>
+            </w:r>
+          </w:p>
+          <w:p>
+            <w:pPr>
+              <w:numPr>
+                <w:ilvl w:val="0"/>
+                <w:numId w:val="31"/>
+              </w:numPr>
+              <w:spacing w:line="276" w:lineRule="auto"/>
+              <w:rPr>
+                <w:rFonts w:ascii="Arial" w:hAnsi="Arial" w:cs="Arial"/>
+              </w:rPr>
+            </w:pPr>
+            <w:r>
+              <w:rPr>
+                <w:rFonts w:ascii="Arial" w:hAnsi="Arial" w:cs="Arial"/>
+              </w:rPr>
+              <w:lastRenderedPageBreak/>
+              <w:t>Oggi iniziare a documentare l’implementazione del codice della parte del calendario, trovare e sistemare possibili bug di salvataggio delle attività, commentare il codice per renderlo più comprensibile.</w:t>
+            </w:r>
+          </w:p>
+        </w:tc>
+      </w:tr>
+    </w:tbl>
+    <w:p>
+      <w:pPr>
+        <w:rPr>
+          <w:rFonts w:ascii="Arial" w:hAnsi="Arial" w:cs="Arial"/>
+        </w:rPr>
+      </w:pPr>
+    </w:p>
+    <w:tbl>
+      <w:tblPr>
+        <w:tblStyle w:val="Grigliatabella"/>
+        <w:tblW w:w="0" w:type="auto"/>
+        <w:tblLook w:val="04A0" w:firstRow="1" w:lastRow="0" w:firstColumn="1" w:lastColumn="0" w:noHBand="0" w:noVBand="1"/>
+      </w:tblPr>
+      <w:tblGrid>
+        <w:gridCol w:w="9628"/>
+      </w:tblGrid>
+      <w:tr>
+        <w:tc>
+          <w:tcPr>
+            <w:tcW w:w="9854" w:type="dxa"/>
+            <w:tcBorders>
+              <w:top w:val="single" w:sz="4" w:space="0" w:color="auto"/>
+              <w:left w:val="single" w:sz="4" w:space="0" w:color="auto"/>
+              <w:bottom w:val="single" w:sz="4" w:space="0" w:color="auto"/>
+              <w:right w:val="single" w:sz="4" w:space="0" w:color="auto"/>
+            </w:tcBorders>
+            <w:shd w:val="clear" w:color="auto" w:fill="D9D9D9" w:themeFill="background1" w:themeFillShade="D9"/>
+            <w:hideMark/>
+          </w:tcPr>
+          <w:p>
+            <w:pPr>
+              <w:spacing w:after="200" w:line="276" w:lineRule="auto"/>
+              <w:rPr>
+                <w:rFonts w:ascii="Arial" w:hAnsi="Arial" w:cs="Arial"/>
+              </w:rPr>
+            </w:pPr>
+            <w:r>
+              <w:rPr>
+                <w:rFonts w:ascii="Arial" w:hAnsi="Arial" w:cs="Arial"/>
+              </w:rPr>
+              <w:t>Sprint Planning</w:t>
+            </w:r>
+          </w:p>
+        </w:tc>
+      </w:tr>
+      <w:tr>
+        <w:tc>
+          <w:tcPr>
+            <w:tcW w:w="9854" w:type="dxa"/>
+            <w:tcBorders>
+              <w:top w:val="single" w:sz="4" w:space="0" w:color="auto"/>
+              <w:left w:val="single" w:sz="4" w:space="0" w:color="auto"/>
+              <w:bottom w:val="single" w:sz="4" w:space="0" w:color="auto"/>
+              <w:right w:val="single" w:sz="4" w:space="0" w:color="auto"/>
+            </w:tcBorders>
+          </w:tcPr>
+          <w:p>
+            <w:pPr>
+              <w:spacing w:after="200" w:line="276" w:lineRule="auto"/>
+              <w:rPr>
+                <w:rFonts w:ascii="Arial" w:hAnsi="Arial" w:cs="Arial"/>
+              </w:rPr>
+            </w:pPr>
+          </w:p>
+        </w:tc>
+      </w:tr>
+    </w:tbl>
+    <w:p>
+      <w:pPr>
+        <w:rPr>
+          <w:rFonts w:ascii="Arial" w:hAnsi="Arial" w:cs="Arial"/>
+        </w:rPr>
+      </w:pPr>
+    </w:p>
+    <w:tbl>
+      <w:tblPr>
+        <w:tblStyle w:val="Grigliatabella"/>
+        <w:tblW w:w="0" w:type="auto"/>
+        <w:tblLook w:val="04A0" w:firstRow="1" w:lastRow="0" w:firstColumn="1" w:lastColumn="0" w:noHBand="0" w:noVBand="1"/>
+      </w:tblPr>
+      <w:tblGrid>
+        <w:gridCol w:w="9628"/>
+      </w:tblGrid>
+      <w:tr>
+        <w:tc>
+          <w:tcPr>
+            <w:tcW w:w="9854" w:type="dxa"/>
+            <w:tcBorders>
+              <w:top w:val="single" w:sz="4" w:space="0" w:color="auto"/>
+              <w:left w:val="single" w:sz="4" w:space="0" w:color="auto"/>
+              <w:bottom w:val="single" w:sz="4" w:space="0" w:color="auto"/>
+              <w:right w:val="single" w:sz="4" w:space="0" w:color="auto"/>
+            </w:tcBorders>
+            <w:shd w:val="clear" w:color="auto" w:fill="D9D9D9" w:themeFill="background1" w:themeFillShade="D9"/>
+            <w:hideMark/>
+          </w:tcPr>
+          <w:p>
+            <w:pPr>
+              <w:spacing w:after="200" w:line="276" w:lineRule="auto"/>
+              <w:rPr>
+                <w:rFonts w:ascii="Arial" w:hAnsi="Arial" w:cs="Arial"/>
+              </w:rPr>
+            </w:pPr>
+            <w:r>
+              <w:rPr>
+                <w:rFonts w:ascii="Arial" w:hAnsi="Arial" w:cs="Arial"/>
+              </w:rPr>
+              <w:t>Sprint Review</w:t>
+            </w:r>
+          </w:p>
+        </w:tc>
+      </w:tr>
+      <w:tr>
+        <w:tc>
+          <w:tcPr>
+            <w:tcW w:w="9854" w:type="dxa"/>
+            <w:tcBorders>
+              <w:top w:val="single" w:sz="4" w:space="0" w:color="auto"/>
+              <w:left w:val="single" w:sz="4" w:space="0" w:color="auto"/>
+              <w:bottom w:val="single" w:sz="4" w:space="0" w:color="auto"/>
+              <w:right w:val="single" w:sz="4" w:space="0" w:color="auto"/>
+            </w:tcBorders>
+          </w:tcPr>
+          <w:p>
+            <w:pPr>
+              <w:rPr>
+                <w:rFonts w:ascii="Arial" w:hAnsi="Arial" w:cs="Arial"/>
+              </w:rPr>
+            </w:pPr>
+          </w:p>
+        </w:tc>
+      </w:tr>
+    </w:tbl>
+    <w:p>
+      <w:pPr>
+        <w:rPr>
+          <w:rFonts w:ascii="Arial" w:hAnsi="Arial" w:cs="Arial"/>
+        </w:rPr>
+      </w:pPr>
+    </w:p>
+    <w:tbl>
+      <w:tblPr>
+        <w:tblStyle w:val="Grigliatabella"/>
+        <w:tblW w:w="0" w:type="auto"/>
+        <w:tblLook w:val="04A0" w:firstRow="1" w:lastRow="0" w:firstColumn="1" w:lastColumn="0" w:noHBand="0" w:noVBand="1"/>
+      </w:tblPr>
+      <w:tblGrid>
+        <w:gridCol w:w="9628"/>
+      </w:tblGrid>
+      <w:tr>
+        <w:tc>
+          <w:tcPr>
+            <w:tcW w:w="9854" w:type="dxa"/>
+            <w:tcBorders>
+              <w:top w:val="single" w:sz="4" w:space="0" w:color="auto"/>
+              <w:left w:val="single" w:sz="4" w:space="0" w:color="auto"/>
+              <w:bottom w:val="single" w:sz="4" w:space="0" w:color="auto"/>
+              <w:right w:val="single" w:sz="4" w:space="0" w:color="auto"/>
+            </w:tcBorders>
+            <w:shd w:val="clear" w:color="auto" w:fill="D9D9D9" w:themeFill="background1" w:themeFillShade="D9"/>
+            <w:hideMark/>
+          </w:tcPr>
+          <w:p>
+            <w:pPr>
+              <w:spacing w:after="200" w:line="276" w:lineRule="auto"/>
+              <w:rPr>
+                <w:rFonts w:ascii="Arial" w:hAnsi="Arial" w:cs="Arial"/>
+              </w:rPr>
+            </w:pPr>
+            <w:r>
+              <w:rPr>
+                <w:rFonts w:ascii="Arial" w:hAnsi="Arial" w:cs="Arial"/>
+              </w:rPr>
+              <w:t>Sprint Retrospective</w:t>
+            </w:r>
+          </w:p>
+        </w:tc>
+      </w:tr>
+      <w:tr>
+        <w:tc>
+          <w:tcPr>
+            <w:tcW w:w="9854" w:type="dxa"/>
+            <w:tcBorders>
+              <w:top w:val="single" w:sz="4" w:space="0" w:color="auto"/>
+              <w:left w:val="single" w:sz="4" w:space="0" w:color="auto"/>
+              <w:bottom w:val="single" w:sz="4" w:space="0" w:color="auto"/>
+              <w:right w:val="single" w:sz="4" w:space="0" w:color="auto"/>
+            </w:tcBorders>
+          </w:tcPr>
+          <w:p>
+            <w:pPr>
               <w:rPr>
                 <w:rFonts w:ascii="Arial" w:hAnsi="Arial" w:cs="Arial"/>
               </w:rPr>
@@ -10626,6 +14562,7 @@
     <w:rsid w:val="000024DA"/>
     <w:rsid w:val="00056466"/>
     <w:rsid w:val="000603D9"/>
+    <w:rsid w:val="00075152"/>
     <w:rsid w:val="00081066"/>
     <w:rsid w:val="0009103E"/>
     <w:rsid w:val="00092592"/>
@@ -10638,6 +14575,7 @@
     <w:rsid w:val="001A0560"/>
     <w:rsid w:val="001C54F7"/>
     <w:rsid w:val="001D27C6"/>
+    <w:rsid w:val="001E4E46"/>
     <w:rsid w:val="001E62F3"/>
     <w:rsid w:val="00221039"/>
     <w:rsid w:val="00251CAF"/>
@@ -10655,11 +14593,13 @@
     <w:rsid w:val="00342E82"/>
     <w:rsid w:val="00357BE2"/>
     <w:rsid w:val="00392F29"/>
+    <w:rsid w:val="003A079E"/>
     <w:rsid w:val="003B7632"/>
     <w:rsid w:val="003F5C32"/>
     <w:rsid w:val="003F61E7"/>
     <w:rsid w:val="004108D2"/>
     <w:rsid w:val="00417A30"/>
+    <w:rsid w:val="004479D4"/>
     <w:rsid w:val="00453BEA"/>
     <w:rsid w:val="004576F0"/>
     <w:rsid w:val="00465B6E"/>
@@ -10682,8 +14622,10 @@
     <w:rsid w:val="00673D1E"/>
     <w:rsid w:val="00682218"/>
     <w:rsid w:val="006D01E3"/>
+    <w:rsid w:val="006E4D06"/>
     <w:rsid w:val="00724B9C"/>
     <w:rsid w:val="00754822"/>
+    <w:rsid w:val="00773F7E"/>
     <w:rsid w:val="007778E5"/>
     <w:rsid w:val="007839C7"/>
     <w:rsid w:val="00793912"/>
@@ -10733,6 +14675,7 @@
     <w:rsid w:val="00D07130"/>
     <w:rsid w:val="00D07A71"/>
     <w:rsid w:val="00D256F5"/>
+    <w:rsid w:val="00D40A7A"/>
     <w:rsid w:val="00D45718"/>
     <w:rsid w:val="00D6666A"/>
     <w:rsid w:val="00D81F90"/>

</xml_diff>